<commit_message>
20-slide presentation (glossary, explainer boxes, worked numbers, UI demo); paper and deck references all 2020+ (37, all cited)
</commit_message>
<xml_diff>
--- a/CARE-EW_Conference_Paper.docx
+++ b/CARE-EW_Conference_Paper.docx
@@ -67,6 +67,17 @@
               <w:t>Reg. No. 24BCE2954</w:t>
             </w:r>
           </w:p>
+        </w:tc>
+        <w:tc>
+          <w:tcPr>
+            <w:tcW w:type="dxa" w:w="3456"/>
+            <w:tcBorders>
+              <w:top w:val="nil"/>
+              <w:bottom w:val="nil"/>
+              <w:left w:val="nil"/>
+              <w:right w:val="nil"/>
+            </w:tcBorders>
+          </w:tcPr>
           <w:p>
             <w:pPr>
               <w:jc w:val="center"/>
@@ -75,38 +86,10 @@
               <w:rPr>
                 <w:rFonts w:ascii="Times New Roman" w:hAnsi="Times New Roman"/>
                 <w:b w:val="0"/>
-                <w:i/>
-                <w:sz w:val="18"/>
+                <w:i w:val="0"/>
+                <w:sz w:val="22"/>
               </w:rPr>
-              <w:t>Department of ____________</w:t>
-            </w:r>
-          </w:p>
-          <w:p>
-            <w:pPr>
-              <w:jc w:val="center"/>
-            </w:pPr>
-            <w:r>
-              <w:rPr>
-                <w:rFonts w:ascii="Times New Roman" w:hAnsi="Times New Roman"/>
-                <w:b w:val="0"/>
-                <w:i/>
-                <w:sz w:val="18"/>
-              </w:rPr>
-              <w:t>____________ (Institution)</w:t>
-            </w:r>
-          </w:p>
-          <w:p>
-            <w:pPr>
-              <w:jc w:val="center"/>
-            </w:pPr>
-            <w:r>
-              <w:rPr>
-                <w:rFonts w:ascii="Times New Roman" w:hAnsi="Times New Roman"/>
-                <w:b w:val="0"/>
-                <w:i/>
-                <w:sz w:val="18"/>
-              </w:rPr>
-              <w:t>City, Country</w:t>
+              <w:t>________________</w:t>
             </w:r>
           </w:p>
           <w:p>
@@ -120,7 +103,7 @@
                 <w:i w:val="0"/>
                 <w:sz w:val="18"/>
               </w:rPr>
-              <w:t>email: ____________</w:t>
+              <w:t>Reg. No. ____________</w:t>
             </w:r>
           </w:p>
         </w:tc>
@@ -162,157 +145,6 @@
               <w:t>Reg. No. ____________</w:t>
             </w:r>
           </w:p>
-          <w:p>
-            <w:pPr>
-              <w:jc w:val="center"/>
-            </w:pPr>
-            <w:r>
-              <w:rPr>
-                <w:rFonts w:ascii="Times New Roman" w:hAnsi="Times New Roman"/>
-                <w:b w:val="0"/>
-                <w:i/>
-                <w:sz w:val="18"/>
-              </w:rPr>
-              <w:t>Department of ____________</w:t>
-            </w:r>
-          </w:p>
-          <w:p>
-            <w:pPr>
-              <w:jc w:val="center"/>
-            </w:pPr>
-            <w:r>
-              <w:rPr>
-                <w:rFonts w:ascii="Times New Roman" w:hAnsi="Times New Roman"/>
-                <w:b w:val="0"/>
-                <w:i/>
-                <w:sz w:val="18"/>
-              </w:rPr>
-              <w:t>____________ (Institution)</w:t>
-            </w:r>
-          </w:p>
-          <w:p>
-            <w:pPr>
-              <w:jc w:val="center"/>
-            </w:pPr>
-            <w:r>
-              <w:rPr>
-                <w:rFonts w:ascii="Times New Roman" w:hAnsi="Times New Roman"/>
-                <w:b w:val="0"/>
-                <w:i/>
-                <w:sz w:val="18"/>
-              </w:rPr>
-              <w:t>City, Country</w:t>
-            </w:r>
-          </w:p>
-          <w:p>
-            <w:pPr>
-              <w:jc w:val="center"/>
-            </w:pPr>
-            <w:r>
-              <w:rPr>
-                <w:rFonts w:ascii="Times New Roman" w:hAnsi="Times New Roman"/>
-                <w:b w:val="0"/>
-                <w:i w:val="0"/>
-                <w:sz w:val="18"/>
-              </w:rPr>
-              <w:t>email: ____________</w:t>
-            </w:r>
-          </w:p>
-        </w:tc>
-        <w:tc>
-          <w:tcPr>
-            <w:tcW w:type="dxa" w:w="3456"/>
-            <w:tcBorders>
-              <w:top w:val="nil"/>
-              <w:bottom w:val="nil"/>
-              <w:left w:val="nil"/>
-              <w:right w:val="nil"/>
-            </w:tcBorders>
-          </w:tcPr>
-          <w:p>
-            <w:pPr>
-              <w:jc w:val="center"/>
-            </w:pPr>
-            <w:r>
-              <w:rPr>
-                <w:rFonts w:ascii="Times New Roman" w:hAnsi="Times New Roman"/>
-                <w:b w:val="0"/>
-                <w:i w:val="0"/>
-                <w:sz w:val="22"/>
-              </w:rPr>
-              <w:t>________________</w:t>
-            </w:r>
-          </w:p>
-          <w:p>
-            <w:pPr>
-              <w:jc w:val="center"/>
-            </w:pPr>
-            <w:r>
-              <w:rPr>
-                <w:rFonts w:ascii="Times New Roman" w:hAnsi="Times New Roman"/>
-                <w:b w:val="0"/>
-                <w:i w:val="0"/>
-                <w:sz w:val="18"/>
-              </w:rPr>
-              <w:t>Reg. No. ____________</w:t>
-            </w:r>
-          </w:p>
-          <w:p>
-            <w:pPr>
-              <w:jc w:val="center"/>
-            </w:pPr>
-            <w:r>
-              <w:rPr>
-                <w:rFonts w:ascii="Times New Roman" w:hAnsi="Times New Roman"/>
-                <w:b w:val="0"/>
-                <w:i/>
-                <w:sz w:val="18"/>
-              </w:rPr>
-              <w:t>Department of ____________</w:t>
-            </w:r>
-          </w:p>
-          <w:p>
-            <w:pPr>
-              <w:jc w:val="center"/>
-            </w:pPr>
-            <w:r>
-              <w:rPr>
-                <w:rFonts w:ascii="Times New Roman" w:hAnsi="Times New Roman"/>
-                <w:b w:val="0"/>
-                <w:i/>
-                <w:sz w:val="18"/>
-              </w:rPr>
-              <w:t>____________ (Institution)</w:t>
-            </w:r>
-          </w:p>
-          <w:p>
-            <w:pPr>
-              <w:jc w:val="center"/>
-            </w:pPr>
-            <w:r>
-              <w:rPr>
-                <w:rFonts w:ascii="Times New Roman" w:hAnsi="Times New Roman"/>
-                <w:b w:val="0"/>
-                <w:i/>
-                <w:sz w:val="18"/>
-              </w:rPr>
-              <w:t>City, Country</w:t>
-            </w:r>
-          </w:p>
-          <w:p>
-            <w:pPr>
-              <w:jc w:val="center"/>
-            </w:pPr>
-            <w:r>
-              <w:rPr>
-                <w:rFonts w:ascii="Times New Roman" w:hAnsi="Times New Roman"/>
-                <w:b w:val="0"/>
-                <w:i w:val="0"/>
-                <w:sz w:val="18"/>
-              </w:rPr>
-              <w:t>email: ____________</w:t>
-            </w:r>
-          </w:p>
         </w:tc>
       </w:tr>
     </w:tbl>
@@ -726,7 +558,7 @@
           <w:i w:val="0"/>
           <w:sz w:val="20"/>
         </w:rPr>
-        <w:t>RESTREND regresses vegetation index on rainfall and treats a declining residual as human-induced degradation [4]. Local Net Production Scaling compares each pixel with land-cover peers in the same region [5]. BFAST decomposes a time series into trend and season and detects breaks [13], and Trends.Earth packages trend, land-cover and carbon sub-indicators for SDG reporting [3]. All are designed to detect change that has already happened.</w:t>
+        <w:t>Time-series residual trend analysis regresses vegetation index on climate and attributes the remaining trend to human activity; applied to global drylands it separates climate-driven from human-driven desertification [4]. Machine-learning classifiers on Sentinel-2 indices map current desertification classes with high accuracy [5], transformer networks on Sentinel-2 time series detect forest disturbance after it occurs [13], and global syntheses trace multiple degradation pathways from such indicators [3]. All are designed to detect change that has already happened.</w:t>
       </w:r>
     </w:p>
     <w:p>
@@ -757,7 +589,7 @@
           <w:i w:val="0"/>
           <w:sz w:val="20"/>
         </w:rPr>
-        <w:t>Large-scale forest products use decision trees on Landsat to map annual tree-cover loss [14], and radar alerts from Sentinel-1 flag disturbance in humid tropical forests within weeks [15]. These systems are accurate for abrupt clearing but react to disturbance under way and are mostly limited to forests.</w:t>
+        <w:t>Spatio-temporal deep learning on Landsat time series classifies land use after deforestation across the tropics [14], and radar alerts from Sentinel-1 flag disturbance in humid tropical forests within weeks [15]. These systems are accurate for abrupt clearing but react to disturbance under way and are mostly limited to forests.</w:t>
       </w:r>
     </w:p>
     <w:p>
@@ -788,7 +620,7 @@
           <w:i w:val="0"/>
           <w:sz w:val="20"/>
         </w:rPr>
-        <w:t>Critical-slowing-down theory predicts rising autocorrelation and variance before a transition [6], [7]. Satellite studies found lower resilience in drought-sensitive tropical forests [8], widespread resilience loss since the early 2000s [9], [10], and spatial-pattern indicators of desertification [16]. These are descriptive; whether they improve held-out forecasts is rarely tested.</w:t>
+        <w:t>Critical-slowing-down theory predicts rising autocorrelation and variance before a transition, and deep networks can learn such signals from time series [6], [7]. A satellite resilience-sensing system for the biosphere has been proposed [8], and studies found widespread resilience loss since the early 2000s [9], [10], declining forest resilience under climate change [34], and aridity thresholds beyond which drylands shift abruptly [16]. These are descriptive; whether they improve held-out forecasts is rarely tested.</w:t>
       </w:r>
     </w:p>
     <w:p>
@@ -1020,7 +852,7 @@
                 <w:i w:val="0"/>
                 <w:sz w:val="13"/>
               </w:rPr>
-              <w:t>Rainfall–NDVI residual trend</w:t>
+              <w:t>Climate–NDVI residual trend</w:t>
             </w:r>
           </w:p>
         </w:tc>
@@ -1046,7 +878,7 @@
                 <w:i w:val="0"/>
                 <w:sz w:val="13"/>
               </w:rPr>
-              <w:t>AVHRR, S. Africa</w:t>
+              <w:t>GIMMS NDVI, global drylands</w:t>
             </w:r>
           </w:p>
         </w:tc>
@@ -1072,7 +904,7 @@
                 <w:i w:val="0"/>
                 <w:sz w:val="13"/>
               </w:rPr>
-              <w:t>Separates human vs. rain effects</w:t>
+              <w:t>Separates human vs. climate effects</w:t>
             </w:r>
           </w:p>
         </w:tc>
@@ -1152,7 +984,7 @@
                 <w:i w:val="0"/>
                 <w:sz w:val="13"/>
               </w:rPr>
-              <w:t>Peer scaling (LNS)</w:t>
+              <w:t>RF / XGBoost classifiers</w:t>
             </w:r>
           </w:p>
         </w:tc>
@@ -1178,7 +1010,7 @@
                 <w:i w:val="0"/>
                 <w:sz w:val="13"/>
               </w:rPr>
-              <w:t>MODIS, Zimbabwe</w:t>
+              <w:t>Sentinel-2, Turkmenistan</w:t>
             </w:r>
           </w:p>
         </w:tc>
@@ -1204,7 +1036,7 @@
                 <w:i w:val="0"/>
                 <w:sz w:val="13"/>
               </w:rPr>
-              <w:t>Relative productivity loss</w:t>
+              <w:t>Desertification classes mapped</w:t>
             </w:r>
           </w:p>
         </w:tc>
@@ -1230,7 +1062,7 @@
                 <w:i w:val="0"/>
                 <w:sz w:val="13"/>
               </w:rPr>
-              <w:t>Retrospective</w:t>
+              <w:t>Current state only</w:t>
             </w:r>
           </w:p>
         </w:tc>
@@ -1284,7 +1116,7 @@
                 <w:i w:val="0"/>
                 <w:sz w:val="13"/>
               </w:rPr>
-              <w:t>Trend–season breaks</w:t>
+              <w:t>Transformer, time series</w:t>
             </w:r>
           </w:p>
         </w:tc>
@@ -1310,7 +1142,7 @@
                 <w:i w:val="0"/>
                 <w:sz w:val="13"/>
               </w:rPr>
-              <w:t>MODIS NDVI</w:t>
+              <w:t>Sentinel-2, C. Europe</w:t>
             </w:r>
           </w:p>
         </w:tc>
@@ -1336,7 +1168,7 @@
                 <w:i w:val="0"/>
                 <w:sz w:val="13"/>
               </w:rPr>
-              <w:t>Abrupt and gradual breaks</w:t>
+              <w:t>Forest disturbance maps</w:t>
             </w:r>
           </w:p>
         </w:tc>
@@ -1416,7 +1248,7 @@
                 <w:i w:val="0"/>
                 <w:sz w:val="13"/>
               </w:rPr>
-              <w:t>Decision trees</w:t>
+              <w:t>Deep learning (CNN + LSTM)</w:t>
             </w:r>
           </w:p>
         </w:tc>
@@ -1442,7 +1274,7 @@
                 <w:i w:val="0"/>
                 <w:sz w:val="13"/>
               </w:rPr>
-              <w:t>Landsat, global</w:t>
+              <w:t>Landsat, pan-tropical</w:t>
             </w:r>
           </w:p>
         </w:tc>
@@ -1468,7 +1300,7 @@
                 <w:i w:val="0"/>
                 <w:sz w:val="13"/>
               </w:rPr>
-              <w:t>Annual tree-cover loss</w:t>
+              <w:t>Land use after deforestation</w:t>
             </w:r>
           </w:p>
         </w:tc>
@@ -1680,7 +1512,7 @@
                 <w:i w:val="0"/>
                 <w:sz w:val="13"/>
               </w:rPr>
-              <w:t>AC1 resilience</w:t>
+              <w:t>Resilience sensing (AC1)</w:t>
             </w:r>
           </w:p>
         </w:tc>
@@ -1706,7 +1538,7 @@
                 <w:i w:val="0"/>
                 <w:sz w:val="13"/>
               </w:rPr>
-              <w:t>AVHRR, tropics</w:t>
+              <w:t>Satellite, global</w:t>
             </w:r>
           </w:p>
         </w:tc>
@@ -1732,7 +1564,7 @@
                 <w:i w:val="0"/>
                 <w:sz w:val="13"/>
               </w:rPr>
-              <w:t>Low resilience before drought impact</w:t>
+              <w:t>Monitoring framework</w:t>
             </w:r>
           </w:p>
         </w:tc>
@@ -2231,7 +2063,7 @@
           <w:i w:val="0"/>
           <w:sz w:val="20"/>
         </w:rPr>
-        <w:t xml:space="preserve"> All inputs are open: Sentinel-2 L2A [23] (10–20 m, 2017–2026), MODIS MOD13Q1 NDVI (250 m, 2000–), ERA5/ERA5-Land [24] climate (precipitation, temperature, soil moisture, reference evapotranspiration), ESA WorldCover 2021 [17], NASADEM terrain, JRC surface water and HydroRIVERS. Landsat 8/9 is used only to check labels.</w:t>
+        <w:t xml:space="preserve"> All inputs are open: Sentinel-2 L2A [23] (10–20 m, 2017–2026), MODIS MOD13Q1 NDVI [25] (250 m, 2000–), ERA5 [27] / ERA5-Land [24] climate (precipitation, temperature, soil moisture, reference evapotranspiration), ESA WorldCover 2021 [17] (the deep-learning Dynamic World product [35] is an alternative), NASADEM terrain, JRC surface water (Landsat-based water mapping [33]) and HydroRIVERS. Landsat 8/9 [28] is used only to check labels. Data are read from the Microsoft Planetary Computer catalogue [37]; the same workflow can run on Google Earth Engine [29].</w:t>
       </w:r>
     </w:p>
     <w:p>
@@ -3998,7 +3830,7 @@
           <w:i w:val="0"/>
           <w:sz w:val="20"/>
         </w:rPr>
-        <w:t xml:space="preserve">LightGBM [18] minimises the weighted logistic loss with an L2 penalty on leaf values </w:t>
+        <w:t xml:space="preserve">LightGBM, a gradient-boosted tree ensemble (tree ensembles remain the strongest model family on tabular data [18]), minimises the weighted logistic loss with an L2 penalty on leaf values </w:t>
       </w:r>
       <w:r>
         <w:rPr>
@@ -4222,7 +4054,7 @@
           <w:i w:val="0"/>
           <w:sz w:val="20"/>
         </w:rPr>
-        <w:t>Each pixel contributes about 40 strongly autocorrelated monthly rows, so deep trees memorise pixels. Trees are therefore kept small (Table III). Scores are calibrated by isotonic regression [19] on a disjoint calibration set. A Mondrian split-conformal predictor [20], [21] with α = 0.10 returns the prediction set:</w:t>
+        <w:t>Each pixel contributes about 40 strongly autocorrelated monthly rows, so deep trees memorise pixels. Trees are therefore kept small (Table III). Scores are calibrated by isotonic regression [19] on a disjoint calibration set. A Mondrian split-conformal predictor [20], [21], as used for land-cover maps [36], with α = 0.10 returns the prediction set:</w:t>
       </w:r>
     </w:p>
     <w:p>
@@ -4875,6 +4707,60 @@
                 <w:sz w:val="14"/>
               </w:rPr>
               <w:t>≥ 11-month gaps = label look-ahead (no leakage)</w:t>
+            </w:r>
+          </w:p>
+        </w:tc>
+      </w:tr>
+      <w:tr>
+        <w:tc>
+          <w:tcPr>
+            <w:tcW w:type="dxa" w:w="1656"/>
+            <w:tcBorders>
+              <w:top w:val="nil"/>
+              <w:bottom w:val="nil"/>
+              <w:left w:val="nil"/>
+              <w:right w:val="nil"/>
+            </w:tcBorders>
+          </w:tcPr>
+          <w:p>
+            <w:pPr>
+              <w:keepNext/>
+              <w:jc w:val="left"/>
+            </w:pPr>
+            <w:r>
+              <w:rPr>
+                <w:rFonts w:ascii="Times New Roman" w:hAnsi="Times New Roman"/>
+                <w:b w:val="0"/>
+                <w:i w:val="0"/>
+                <w:sz w:val="14"/>
+              </w:rPr>
+              <w:t>Software</w:t>
+            </w:r>
+          </w:p>
+        </w:tc>
+        <w:tc>
+          <w:tcPr>
+            <w:tcW w:type="dxa" w:w="3312"/>
+            <w:tcBorders>
+              <w:top w:val="nil"/>
+              <w:bottom w:val="nil"/>
+              <w:left w:val="nil"/>
+              <w:right w:val="nil"/>
+            </w:tcBorders>
+          </w:tcPr>
+          <w:p>
+            <w:pPr>
+              <w:keepNext/>
+              <w:jc w:val="center"/>
+            </w:pPr>
+            <w:r>
+              <w:rPr>
+                <w:rFonts w:ascii="Times New Roman" w:hAnsi="Times New Roman"/>
+                <w:b w:val="0"/>
+                <w:i w:val="0"/>
+                <w:sz w:val="14"/>
+              </w:rPr>
+              <w:t>Python; LightGBM, scikit-learn, SHAP [32]</w:t>
             </w:r>
           </w:p>
         </w:tc>
@@ -6145,7 +6031,7 @@
           <w:i w:val="0"/>
           <w:sz w:val="20"/>
         </w:rPr>
-        <w:t>Further pre-registered experiments were rejected because they did not raise validation AP by at least 0.005: GLCM texture, red-edge chlorophyll indices, doubling the pixels per site, confident-learning label cleaning [22], a five-seed ensemble and training on all 23 sites.</w:t>
+        <w:t>Further pre-registered experiments were rejected because they did not raise validation AP by at least 0.005: GLCM texture (a hand-crafted stand-in for the spatial filters a CNN learns [31]), red-edge chlorophyll indices, doubling the pixels per site, confident-learning label cleaning [22], a five-seed ensemble and training on all 23 sites.</w:t>
       </w:r>
     </w:p>
     <w:p>
@@ -8423,7 +8309,7 @@
           <w:i w:val="0"/>
           <w:sz w:val="20"/>
         </w:rPr>
-        <w:t>The ablation supports the central hypothesis in a falsifiable way. If future degradation could be read from present greenness or from weather alone, groups A1–A3 would score well; they do not. Skill appears only once each pixel is compared with what climate and its landscape peers predict, and it grows when the autocorrelation and variance of that residual are added. This is the pattern critical-slowing-down theory predicts [6], [7], here tested on held-out data rather than assumed. We do not claim that rising autocorrelation marks a tipping point, only that it improves forecasts.</w:t>
+        <w:t>The ablation supports the central hypothesis in a falsifiable way. If future degradation could be read from present greenness or from weather alone, groups A1–A3 would score well; they do not. Skill appears only once each pixel is compared with what climate and its landscape peers predict, and it grows when the autocorrelation and variance of that residual are added. SHAP attributions [32] agree: the most influential features are the MODIS 5-year variance, the share of the last 12 months below expectation and the 24-month AC1. This is the pattern critical-slowing-down theory predicts [6], [7], here tested on held-out data rather than assumed. We do not claim that rising autocorrelation marks a tipping point, only that it improves forecasts.</w:t>
       </w:r>
     </w:p>
     <w:p>
@@ -8586,7 +8472,7 @@
           <w:i w:val="0"/>
           <w:sz w:val="20"/>
         </w:rPr>
-        <w:t xml:space="preserve"> The Sentinel-2 baseline covers only 2017–2020, and climate is at 9–25 km.</w:t>
+        <w:t xml:space="preserve"> The Sentinel-2 baseline covers only 2017–2020, climate is at 9–25 km, and ERA5 rainfall is weaker than gauge-blended products over convective tropics, where deep-learning retrievals are improving [26].</w:t>
       </w:r>
     </w:p>
     <w:p>
@@ -8774,7 +8660,7 @@
           <w:i w:val="0"/>
           <w:sz w:val="20"/>
         </w:rPr>
-        <w:t>Sentinel-1 radar features to fill monsoon cloud gaps.</w:t>
+        <w:t>Sentinel-1 radar features to fill monsoon cloud gaps, and SoilGrids [30] soil properties to separate erosion-prone soils.</w:t>
       </w:r>
     </w:p>
     <w:p>
@@ -8815,7 +8701,7 @@
           <w:i w:val="0"/>
           <w:sz w:val="16"/>
         </w:rPr>
-        <w:t xml:space="preserve">M. Cherlet et al., Eds., </w:t>
+        <w:t xml:space="preserve">UNCCD, </w:t>
       </w:r>
       <w:r>
         <w:rPr>
@@ -8824,7 +8710,7 @@
           <w:i/>
           <w:sz w:val="16"/>
         </w:rPr>
-        <w:t>World Atlas of Desertification</w:t>
+        <w:t>Global Land Outlook</w:t>
       </w:r>
       <w:r>
         <w:rPr>
@@ -8833,7 +8719,7 @@
           <w:i w:val="0"/>
           <w:sz w:val="16"/>
         </w:rPr>
-        <w:t>, 3rd ed. Luxembourg: Publications Office of the EU, 2018.</w:t>
+        <w:t>, 2nd ed., “Land Restoration for Recovery and Resilience.” Bonn, Germany: United Nations Convention to Combat Desertification, 2022.</w:t>
       </w:r>
     </w:p>
     <w:p>
@@ -8881,7 +8767,7 @@
           <w:i w:val="0"/>
           <w:sz w:val="16"/>
         </w:rPr>
-        <w:t xml:space="preserve">M. Gonzalez-Roglich et al., “Synergizing global tools to monitor progress towards land degradation neutrality: Trends.Earth and the World Overview of Conservation Approaches and Technologies sustainable land management database,” </w:t>
+        <w:t xml:space="preserve">R. Prăvălie, “Exploring the multiple land degradation pathways across the planet,” </w:t>
       </w:r>
       <w:r>
         <w:rPr>
@@ -8890,7 +8776,7 @@
           <w:i/>
           <w:sz w:val="16"/>
         </w:rPr>
-        <w:t>Environ. Sci. Policy</w:t>
+        <w:t>Earth-Sci. Rev.</w:t>
       </w:r>
       <w:r>
         <w:rPr>
@@ -8899,7 +8785,7 @@
           <w:i w:val="0"/>
           <w:sz w:val="16"/>
         </w:rPr>
-        <w:t>, vol. 93, pp. 34–42, 2019.</w:t>
+        <w:t>, vol. 220, Art. no. 103689, 2021, doi: 10.1016/j.earscirev.2021.103689.</w:t>
       </w:r>
     </w:p>
     <w:p>
@@ -8923,7 +8809,7 @@
           <w:i w:val="0"/>
           <w:sz w:val="16"/>
         </w:rPr>
-        <w:t xml:space="preserve">K. J. Wessels et al., “Can human-induced land degradation be distinguished from the effects of rainfall variability? A case study in South Africa,” </w:t>
+        <w:t xml:space="preserve">A. L. Burrell, J. P. Evans, and M. G. De Kauwe, “Anthropogenic climate change has driven over 5 million km² of drylands towards desertification,” </w:t>
       </w:r>
       <w:r>
         <w:rPr>
@@ -8932,7 +8818,7 @@
           <w:i/>
           <w:sz w:val="16"/>
         </w:rPr>
-        <w:t>J. Arid Environ.</w:t>
+        <w:t>Nature Commun.</w:t>
       </w:r>
       <w:r>
         <w:rPr>
@@ -8941,7 +8827,7 @@
           <w:i w:val="0"/>
           <w:sz w:val="16"/>
         </w:rPr>
-        <w:t>, vol. 68, no. 2, pp. 271–297, 2007.</w:t>
+        <w:t>, vol. 11, Art. no. 3853, 2020, doi: 10.1038/s41467-020-17710-7.</w:t>
       </w:r>
     </w:p>
     <w:p>
@@ -8965,7 +8851,7 @@
           <w:i w:val="0"/>
           <w:sz w:val="16"/>
         </w:rPr>
-        <w:t xml:space="preserve">S. D. Prince, I. Becker-Reshef, and K. Rishmawi, “Detection and mapping of long-term land degradation using local net production scaling: Application to Zimbabwe,” </w:t>
+        <w:t xml:space="preserve">A. Berdyyev, Y. A. Al-Masnay, M. Juliev, and J. Abuduwaili, “Desertification monitoring using machine learning techniques with multiple indicators derived from Sentinel-2 in Turkmenistan,” </w:t>
       </w:r>
       <w:r>
         <w:rPr>
@@ -8974,7 +8860,7 @@
           <w:i/>
           <w:sz w:val="16"/>
         </w:rPr>
-        <w:t>Remote Sens. Environ.</w:t>
+        <w:t>Remote Sens.</w:t>
       </w:r>
       <w:r>
         <w:rPr>
@@ -8983,7 +8869,7 @@
           <w:i w:val="0"/>
           <w:sz w:val="16"/>
         </w:rPr>
-        <w:t>, vol. 113, no. 5, pp. 1046–1057, 2009.</w:t>
+        <w:t>, vol. 16, no. 23, Art. no. 4525, 2024, doi: 10.3390/rs16234525.</w:t>
       </w:r>
     </w:p>
     <w:p>
@@ -9007,7 +8893,7 @@
           <w:i w:val="0"/>
           <w:sz w:val="16"/>
         </w:rPr>
-        <w:t xml:space="preserve">M. Scheffer et al., “Early-warning signals for critical transitions,” </w:t>
+        <w:t xml:space="preserve">T. M. Bury et al., “Deep learning for early warning signals of tipping points,” </w:t>
       </w:r>
       <w:r>
         <w:rPr>
@@ -9016,7 +8902,7 @@
           <w:i/>
           <w:sz w:val="16"/>
         </w:rPr>
-        <w:t>Nature</w:t>
+        <w:t>Proc. Natl. Acad. Sci. USA</w:t>
       </w:r>
       <w:r>
         <w:rPr>
@@ -9025,7 +8911,7 @@
           <w:i w:val="0"/>
           <w:sz w:val="16"/>
         </w:rPr>
-        <w:t>, vol. 461, pp. 53–59, 2009.</w:t>
+        <w:t>, vol. 118, no. 39, Art. no. e2106140118, 2021, doi: 10.1073/pnas.2106140118.</w:t>
       </w:r>
     </w:p>
     <w:p>
@@ -9049,7 +8935,7 @@
           <w:i w:val="0"/>
           <w:sz w:val="16"/>
         </w:rPr>
-        <w:t xml:space="preserve">V. Dakos et al., “Methods for detecting early warnings of critical transitions in time series illustrated using simulated ecological data,” </w:t>
+        <w:t xml:space="preserve">V. Dakos et al., “Tipping point detection and early warnings in climate, ecological, and human systems,” </w:t>
       </w:r>
       <w:r>
         <w:rPr>
@@ -9058,7 +8944,7 @@
           <w:i/>
           <w:sz w:val="16"/>
         </w:rPr>
-        <w:t>PLoS ONE</w:t>
+        <w:t>Earth Syst. Dyn.</w:t>
       </w:r>
       <w:r>
         <w:rPr>
@@ -9067,7 +8953,7 @@
           <w:i w:val="0"/>
           <w:sz w:val="16"/>
         </w:rPr>
-        <w:t>, vol. 7, no. 7, e41010, 2012.</w:t>
+        <w:t>, vol. 15, no. 4, pp. 1117–1135, 2024, doi: 10.5194/esd-15-1117-2024.</w:t>
       </w:r>
     </w:p>
     <w:p>
@@ -9091,7 +8977,7 @@
           <w:i w:val="0"/>
           <w:sz w:val="16"/>
         </w:rPr>
-        <w:t xml:space="preserve">J. Verbesselt et al., “Remotely sensed resilience of tropical forests,” </w:t>
+        <w:t xml:space="preserve">T. M. Lenton et al., “A resilience sensing system for the biosphere,” </w:t>
       </w:r>
       <w:r>
         <w:rPr>
@@ -9100,7 +8986,7 @@
           <w:i/>
           <w:sz w:val="16"/>
         </w:rPr>
-        <w:t>Nature Clim. Change</w:t>
+        <w:t>Phil. Trans. R. Soc. B</w:t>
       </w:r>
       <w:r>
         <w:rPr>
@@ -9109,7 +8995,7 @@
           <w:i w:val="0"/>
           <w:sz w:val="16"/>
         </w:rPr>
-        <w:t>, vol. 6, pp. 1028–1031, 2016.</w:t>
+        <w:t>, vol. 377, no. 1857, Art. no. 20210383, 2022, doi: 10.1098/rstb.2021.0383.</w:t>
       </w:r>
     </w:p>
     <w:p>
@@ -9301,7 +9187,7 @@
           <w:i w:val="0"/>
           <w:sz w:val="16"/>
         </w:rPr>
-        <w:t xml:space="preserve">J. Verbesselt, R. Hyndman, G. Newnham, and D. Culvenor, “Detecting trend and seasonal changes in satellite image time series,” </w:t>
+        <w:t xml:space="preserve">C. Schiller, J. Költzow, S. Schwarz, F. Schiefer, and F. E. Fassnacht, “Forest disturbance detection in Central Europe using transformers and Sentinel-2 time series,” </w:t>
       </w:r>
       <w:r>
         <w:rPr>
@@ -9319,7 +9205,7 @@
           <w:i w:val="0"/>
           <w:sz w:val="16"/>
         </w:rPr>
-        <w:t>, vol. 114, no. 1, pp. 106–115, 2010.</w:t>
+        <w:t>, vol. 315, Art. no. 114475, 2024, doi: 10.1016/j.rse.2024.114475.</w:t>
       </w:r>
     </w:p>
     <w:p>
@@ -9343,7 +9229,7 @@
           <w:i w:val="0"/>
           <w:sz w:val="16"/>
         </w:rPr>
-        <w:t xml:space="preserve">M. C. Hansen et al., “High-resolution global maps of 21st-century forest cover change,” </w:t>
+        <w:t xml:space="preserve">R. N. Masolele et al., “Spatial and temporal deep learning methods for deriving land-use following deforestation: A pan-tropical case study using Landsat time series,” </w:t>
       </w:r>
       <w:r>
         <w:rPr>
@@ -9352,7 +9238,7 @@
           <w:i/>
           <w:sz w:val="16"/>
         </w:rPr>
-        <w:t>Science</w:t>
+        <w:t>Remote Sens. Environ.</w:t>
       </w:r>
       <w:r>
         <w:rPr>
@@ -9361,7 +9247,7 @@
           <w:i w:val="0"/>
           <w:sz w:val="16"/>
         </w:rPr>
-        <w:t>, vol. 342, pp. 850–853, 2013.</w:t>
+        <w:t>, vol. 264, Art. no. 112600, 2021, doi: 10.1016/j.rse.2021.112600.</w:t>
       </w:r>
     </w:p>
     <w:p>
@@ -9427,7 +9313,7 @@
           <w:i w:val="0"/>
           <w:sz w:val="16"/>
         </w:rPr>
-        <w:t xml:space="preserve">S. Kéfi et al., “Spatial vegetation patterns and imminent desertification in Mediterranean arid ecosystems,” </w:t>
+        <w:t xml:space="preserve">M. Berdugo et al., “Global ecosystem thresholds driven by aridity,” </w:t>
       </w:r>
       <w:r>
         <w:rPr>
@@ -9436,7 +9322,7 @@
           <w:i/>
           <w:sz w:val="16"/>
         </w:rPr>
-        <w:t>Nature</w:t>
+        <w:t>Science</w:t>
       </w:r>
       <w:r>
         <w:rPr>
@@ -9445,7 +9331,7 @@
           <w:i w:val="0"/>
           <w:sz w:val="16"/>
         </w:rPr>
-        <w:t>, vol. 449, pp. 213–217, 2007.</w:t>
+        <w:t>, vol. 367, no. 6479, pp. 787–790, 2020, doi: 10.1126/science.aay5958.</w:t>
       </w:r>
     </w:p>
     <w:p>
@@ -9493,7 +9379,7 @@
           <w:i w:val="0"/>
           <w:sz w:val="16"/>
         </w:rPr>
-        <w:t xml:space="preserve">G. Ke et al., “LightGBM: A highly efficient gradient boosting decision tree,” in </w:t>
+        <w:t xml:space="preserve">L. Grinsztajn, E. Oyallon, and G. Varoquaux, “Why do tree-based models still outperform deep learning on typical tabular data?” in </w:t>
       </w:r>
       <w:r>
         <w:rPr>
@@ -9502,7 +9388,7 @@
           <w:i/>
           <w:sz w:val="16"/>
         </w:rPr>
-        <w:t>Proc. NeurIPS</w:t>
+        <w:t>Proc. NeurIPS Datasets and Benchmarks Track</w:t>
       </w:r>
       <w:r>
         <w:rPr>
@@ -9511,7 +9397,7 @@
           <w:i w:val="0"/>
           <w:sz w:val="16"/>
         </w:rPr>
-        <w:t>, 2017, pp. 3146–3154.</w:t>
+        <w:t>, vol. 35, 2022, pp. 507–520.</w:t>
       </w:r>
     </w:p>
     <w:p>
@@ -9535,7 +9421,7 @@
           <w:i w:val="0"/>
           <w:sz w:val="16"/>
         </w:rPr>
-        <w:t xml:space="preserve">B. Zadrozny and C. Elkan, “Transforming classifier scores into accurate multiclass probability estimates,” in </w:t>
+        <w:t xml:space="preserve">T. Silva Filho et al., “Classifier calibration: A survey on how to assess and improve predicted class probabilities,” </w:t>
       </w:r>
       <w:r>
         <w:rPr>
@@ -9544,7 +9430,7 @@
           <w:i/>
           <w:sz w:val="16"/>
         </w:rPr>
-        <w:t>Proc. ACM SIGKDD</w:t>
+        <w:t>Mach. Learn.</w:t>
       </w:r>
       <w:r>
         <w:rPr>
@@ -9553,7 +9439,7 @@
           <w:i w:val="0"/>
           <w:sz w:val="16"/>
         </w:rPr>
-        <w:t>, 2002, pp. 694–699.</w:t>
+        <w:t>, vol. 112, no. 9, pp. 3211–3260, 2023, doi: 10.1007/s10994-023-06336-7.</w:t>
       </w:r>
     </w:p>
     <w:p>
@@ -9595,7 +9481,7 @@
           <w:i w:val="0"/>
           <w:sz w:val="16"/>
         </w:rPr>
-        <w:t>. New York, NY, USA: Springer, 2005.</w:t>
+        <w:t>, 2nd ed. Cham, Switzerland: Springer, 2022, doi: 10.1007/978-3-031-06649-8.</w:t>
       </w:r>
     </w:p>
     <w:p>
@@ -9703,7 +9589,7 @@
           <w:i w:val="0"/>
           <w:sz w:val="16"/>
         </w:rPr>
-        <w:t xml:space="preserve">M. Drusch et al., “Sentinel-2: ESA's optical high-resolution mission for GMES operational services,” </w:t>
+        <w:t xml:space="preserve">D. Phiri et al., “Sentinel-2 data for land cover/use mapping: A review,” </w:t>
       </w:r>
       <w:r>
         <w:rPr>
@@ -9712,7 +9598,7 @@
           <w:i/>
           <w:sz w:val="16"/>
         </w:rPr>
-        <w:t>Remote Sens. Environ.</w:t>
+        <w:t>Remote Sens.</w:t>
       </w:r>
       <w:r>
         <w:rPr>
@@ -9721,7 +9607,7 @@
           <w:i w:val="0"/>
           <w:sz w:val="16"/>
         </w:rPr>
-        <w:t>, vol. 120, pp. 25–36, 2012.</w:t>
+        <w:t>, vol. 12, no. 14, Art. no. 2291, 2020, doi: 10.3390/rs12142291.</w:t>
       </w:r>
     </w:p>
     <w:p>
@@ -9764,6 +9650,516 @@
           <w:sz w:val="16"/>
         </w:rPr>
         <w:t>, vol. 13, pp. 4349–4383, 2021.</w:t>
+      </w:r>
+    </w:p>
+    <w:p>
+      <w:pPr>
+        <w:ind w:left="360" w:hanging="360"/>
+        <w:jc w:val="both"/>
+      </w:pPr>
+      <w:r>
+        <w:rPr>
+          <w:rFonts w:ascii="Times New Roman" w:hAnsi="Times New Roman"/>
+          <w:b w:val="0"/>
+          <w:i w:val="0"/>
+          <w:sz w:val="16"/>
+        </w:rPr>
+        <w:t xml:space="preserve">[25] </w:t>
+      </w:r>
+      <w:r>
+        <w:rPr>
+          <w:rFonts w:ascii="Times New Roman" w:hAnsi="Times New Roman"/>
+          <w:b w:val="0"/>
+          <w:i w:val="0"/>
+          <w:sz w:val="16"/>
+        </w:rPr>
+        <w:t>K. Didan, “MOD13Q1 MODIS/Terra vegetation indices 16-day L3 global 250 m SIN grid V061,” NASA EOSDIS Land Processes DAAC, 2021, doi: 10.5067/MODIS/MOD13Q1.061.</w:t>
+      </w:r>
+    </w:p>
+    <w:p>
+      <w:pPr>
+        <w:ind w:left="360" w:hanging="360"/>
+        <w:jc w:val="both"/>
+      </w:pPr>
+      <w:r>
+        <w:rPr>
+          <w:rFonts w:ascii="Times New Roman" w:hAnsi="Times New Roman"/>
+          <w:b w:val="0"/>
+          <w:i w:val="0"/>
+          <w:sz w:val="16"/>
+        </w:rPr>
+        <w:t xml:space="preserve">[26] </w:t>
+      </w:r>
+      <w:r>
+        <w:rPr>
+          <w:rFonts w:ascii="Times New Roman" w:hAnsi="Times New Roman"/>
+          <w:b w:val="0"/>
+          <w:i w:val="0"/>
+          <w:sz w:val="16"/>
+        </w:rPr>
+        <w:t xml:space="preserve">Q. Yuan et al., “Deep learning in environmental remote sensing: Achievements and challenges,” </w:t>
+      </w:r>
+      <w:r>
+        <w:rPr>
+          <w:rFonts w:ascii="Times New Roman" w:hAnsi="Times New Roman"/>
+          <w:b w:val="0"/>
+          <w:i/>
+          <w:sz w:val="16"/>
+        </w:rPr>
+        <w:t>Remote Sens. Environ.</w:t>
+      </w:r>
+      <w:r>
+        <w:rPr>
+          <w:rFonts w:ascii="Times New Roman" w:hAnsi="Times New Roman"/>
+          <w:b w:val="0"/>
+          <w:i w:val="0"/>
+          <w:sz w:val="16"/>
+        </w:rPr>
+        <w:t>, vol. 241, Art. no. 111716, 2020, doi: 10.1016/j.rse.2020.111716.</w:t>
+      </w:r>
+    </w:p>
+    <w:p>
+      <w:pPr>
+        <w:ind w:left="360" w:hanging="360"/>
+        <w:jc w:val="both"/>
+      </w:pPr>
+      <w:r>
+        <w:rPr>
+          <w:rFonts w:ascii="Times New Roman" w:hAnsi="Times New Roman"/>
+          <w:b w:val="0"/>
+          <w:i w:val="0"/>
+          <w:sz w:val="16"/>
+        </w:rPr>
+        <w:t xml:space="preserve">[27] </w:t>
+      </w:r>
+      <w:r>
+        <w:rPr>
+          <w:rFonts w:ascii="Times New Roman" w:hAnsi="Times New Roman"/>
+          <w:b w:val="0"/>
+          <w:i w:val="0"/>
+          <w:sz w:val="16"/>
+        </w:rPr>
+        <w:t xml:space="preserve">H. Hersbach et al., “The ERA5 global reanalysis,” </w:t>
+      </w:r>
+      <w:r>
+        <w:rPr>
+          <w:rFonts w:ascii="Times New Roman" w:hAnsi="Times New Roman"/>
+          <w:b w:val="0"/>
+          <w:i/>
+          <w:sz w:val="16"/>
+        </w:rPr>
+        <w:t>Q. J. R. Meteorol. Soc.</w:t>
+      </w:r>
+      <w:r>
+        <w:rPr>
+          <w:rFonts w:ascii="Times New Roman" w:hAnsi="Times New Roman"/>
+          <w:b w:val="0"/>
+          <w:i w:val="0"/>
+          <w:sz w:val="16"/>
+        </w:rPr>
+        <w:t>, vol. 146, no. 730, pp. 1999–2049, 2020.</w:t>
+      </w:r>
+    </w:p>
+    <w:p>
+      <w:pPr>
+        <w:ind w:left="360" w:hanging="360"/>
+        <w:jc w:val="both"/>
+      </w:pPr>
+      <w:r>
+        <w:rPr>
+          <w:rFonts w:ascii="Times New Roman" w:hAnsi="Times New Roman"/>
+          <w:b w:val="0"/>
+          <w:i w:val="0"/>
+          <w:sz w:val="16"/>
+        </w:rPr>
+        <w:t xml:space="preserve">[28] </w:t>
+      </w:r>
+      <w:r>
+        <w:rPr>
+          <w:rFonts w:ascii="Times New Roman" w:hAnsi="Times New Roman"/>
+          <w:b w:val="0"/>
+          <w:i w:val="0"/>
+          <w:sz w:val="16"/>
+        </w:rPr>
+        <w:t xml:space="preserve">M. A. Wulder et al., “Fifty years of Landsat science and impacts,” </w:t>
+      </w:r>
+      <w:r>
+        <w:rPr>
+          <w:rFonts w:ascii="Times New Roman" w:hAnsi="Times New Roman"/>
+          <w:b w:val="0"/>
+          <w:i/>
+          <w:sz w:val="16"/>
+        </w:rPr>
+        <w:t>Remote Sens. Environ.</w:t>
+      </w:r>
+      <w:r>
+        <w:rPr>
+          <w:rFonts w:ascii="Times New Roman" w:hAnsi="Times New Roman"/>
+          <w:b w:val="0"/>
+          <w:i w:val="0"/>
+          <w:sz w:val="16"/>
+        </w:rPr>
+        <w:t>, vol. 280, 113195, 2022.</w:t>
+      </w:r>
+    </w:p>
+    <w:p>
+      <w:pPr>
+        <w:ind w:left="360" w:hanging="360"/>
+        <w:jc w:val="both"/>
+      </w:pPr>
+      <w:r>
+        <w:rPr>
+          <w:rFonts w:ascii="Times New Roman" w:hAnsi="Times New Roman"/>
+          <w:b w:val="0"/>
+          <w:i w:val="0"/>
+          <w:sz w:val="16"/>
+        </w:rPr>
+        <w:t xml:space="preserve">[29] </w:t>
+      </w:r>
+      <w:r>
+        <w:rPr>
+          <w:rFonts w:ascii="Times New Roman" w:hAnsi="Times New Roman"/>
+          <w:b w:val="0"/>
+          <w:i w:val="0"/>
+          <w:sz w:val="16"/>
+        </w:rPr>
+        <w:t xml:space="preserve">M. Amani et al., “Google Earth Engine cloud computing platform for remote sensing big data applications: A comprehensive review,” </w:t>
+      </w:r>
+      <w:r>
+        <w:rPr>
+          <w:rFonts w:ascii="Times New Roman" w:hAnsi="Times New Roman"/>
+          <w:b w:val="0"/>
+          <w:i/>
+          <w:sz w:val="16"/>
+        </w:rPr>
+        <w:t>IEEE J. Sel. Topics Appl. Earth Observ. Remote Sens.</w:t>
+      </w:r>
+      <w:r>
+        <w:rPr>
+          <w:rFonts w:ascii="Times New Roman" w:hAnsi="Times New Roman"/>
+          <w:b w:val="0"/>
+          <w:i w:val="0"/>
+          <w:sz w:val="16"/>
+        </w:rPr>
+        <w:t>, vol. 13, pp. 5326–5350, 2020, doi: 10.1109/JSTARS.2020.3021052.</w:t>
+      </w:r>
+    </w:p>
+    <w:p>
+      <w:pPr>
+        <w:ind w:left="360" w:hanging="360"/>
+        <w:jc w:val="both"/>
+      </w:pPr>
+      <w:r>
+        <w:rPr>
+          <w:rFonts w:ascii="Times New Roman" w:hAnsi="Times New Roman"/>
+          <w:b w:val="0"/>
+          <w:i w:val="0"/>
+          <w:sz w:val="16"/>
+        </w:rPr>
+        <w:t xml:space="preserve">[30] </w:t>
+      </w:r>
+      <w:r>
+        <w:rPr>
+          <w:rFonts w:ascii="Times New Roman" w:hAnsi="Times New Roman"/>
+          <w:b w:val="0"/>
+          <w:i w:val="0"/>
+          <w:sz w:val="16"/>
+        </w:rPr>
+        <w:t xml:space="preserve">L. Poggio et al., “SoilGrids 2.0: Producing soil information for the globe with quantified spatial uncertainty,” </w:t>
+      </w:r>
+      <w:r>
+        <w:rPr>
+          <w:rFonts w:ascii="Times New Roman" w:hAnsi="Times New Roman"/>
+          <w:b w:val="0"/>
+          <w:i/>
+          <w:sz w:val="16"/>
+        </w:rPr>
+        <w:t>SOIL</w:t>
+      </w:r>
+      <w:r>
+        <w:rPr>
+          <w:rFonts w:ascii="Times New Roman" w:hAnsi="Times New Roman"/>
+          <w:b w:val="0"/>
+          <w:i w:val="0"/>
+          <w:sz w:val="16"/>
+        </w:rPr>
+        <w:t>, vol. 7, pp. 217–240, 2021.</w:t>
+      </w:r>
+    </w:p>
+    <w:p>
+      <w:pPr>
+        <w:ind w:left="360" w:hanging="360"/>
+        <w:jc w:val="both"/>
+      </w:pPr>
+      <w:r>
+        <w:rPr>
+          <w:rFonts w:ascii="Times New Roman" w:hAnsi="Times New Roman"/>
+          <w:b w:val="0"/>
+          <w:i w:val="0"/>
+          <w:sz w:val="16"/>
+        </w:rPr>
+        <w:t xml:space="preserve">[31] </w:t>
+      </w:r>
+      <w:r>
+        <w:rPr>
+          <w:rFonts w:ascii="Times New Roman" w:hAnsi="Times New Roman"/>
+          <w:b w:val="0"/>
+          <w:i w:val="0"/>
+          <w:sz w:val="16"/>
+        </w:rPr>
+        <w:t xml:space="preserve">T. Kattenborn, J. Leitloff, F. Schiefer, and S. Hinz, “Review on convolutional neural networks (CNN) in vegetation remote sensing,” </w:t>
+      </w:r>
+      <w:r>
+        <w:rPr>
+          <w:rFonts w:ascii="Times New Roman" w:hAnsi="Times New Roman"/>
+          <w:b w:val="0"/>
+          <w:i/>
+          <w:sz w:val="16"/>
+        </w:rPr>
+        <w:t>ISPRS J. Photogramm. Remote Sens.</w:t>
+      </w:r>
+      <w:r>
+        <w:rPr>
+          <w:rFonts w:ascii="Times New Roman" w:hAnsi="Times New Roman"/>
+          <w:b w:val="0"/>
+          <w:i w:val="0"/>
+          <w:sz w:val="16"/>
+        </w:rPr>
+        <w:t>, vol. 173, pp. 24–49, 2021, doi: 10.1016/j.isprsjprs.2020.12.010.</w:t>
+      </w:r>
+    </w:p>
+    <w:p>
+      <w:pPr>
+        <w:ind w:left="360" w:hanging="360"/>
+        <w:jc w:val="both"/>
+      </w:pPr>
+      <w:r>
+        <w:rPr>
+          <w:rFonts w:ascii="Times New Roman" w:hAnsi="Times New Roman"/>
+          <w:b w:val="0"/>
+          <w:i w:val="0"/>
+          <w:sz w:val="16"/>
+        </w:rPr>
+        <w:t xml:space="preserve">[32] </w:t>
+      </w:r>
+      <w:r>
+        <w:rPr>
+          <w:rFonts w:ascii="Times New Roman" w:hAnsi="Times New Roman"/>
+          <w:b w:val="0"/>
+          <w:i w:val="0"/>
+          <w:sz w:val="16"/>
+        </w:rPr>
+        <w:t xml:space="preserve">S. M. Lundberg et al., “From local explanations to global understanding with explainable AI for trees,” </w:t>
+      </w:r>
+      <w:r>
+        <w:rPr>
+          <w:rFonts w:ascii="Times New Roman" w:hAnsi="Times New Roman"/>
+          <w:b w:val="0"/>
+          <w:i/>
+          <w:sz w:val="16"/>
+        </w:rPr>
+        <w:t>Nature Mach. Intell.</w:t>
+      </w:r>
+      <w:r>
+        <w:rPr>
+          <w:rFonts w:ascii="Times New Roman" w:hAnsi="Times New Roman"/>
+          <w:b w:val="0"/>
+          <w:i w:val="0"/>
+          <w:sz w:val="16"/>
+        </w:rPr>
+        <w:t>, vol. 2, no. 1, pp. 56–67, 2020, doi: 10.1038/s42256-019-0138-9.</w:t>
+      </w:r>
+    </w:p>
+    <w:p>
+      <w:pPr>
+        <w:ind w:left="360" w:hanging="360"/>
+        <w:jc w:val="both"/>
+      </w:pPr>
+      <w:r>
+        <w:rPr>
+          <w:rFonts w:ascii="Times New Roman" w:hAnsi="Times New Roman"/>
+          <w:b w:val="0"/>
+          <w:i w:val="0"/>
+          <w:sz w:val="16"/>
+        </w:rPr>
+        <w:t xml:space="preserve">[33] </w:t>
+      </w:r>
+      <w:r>
+        <w:rPr>
+          <w:rFonts w:ascii="Times New Roman" w:hAnsi="Times New Roman"/>
+          <w:b w:val="0"/>
+          <w:i w:val="0"/>
+          <w:sz w:val="16"/>
+        </w:rPr>
+        <w:t xml:space="preserve">A. H. Pickens et al., “Mapping and sampling to characterize global inland water dynamics from 1999 to 2018 with full Landsat time-series,” </w:t>
+      </w:r>
+      <w:r>
+        <w:rPr>
+          <w:rFonts w:ascii="Times New Roman" w:hAnsi="Times New Roman"/>
+          <w:b w:val="0"/>
+          <w:i/>
+          <w:sz w:val="16"/>
+        </w:rPr>
+        <w:t>Remote Sens. Environ.</w:t>
+      </w:r>
+      <w:r>
+        <w:rPr>
+          <w:rFonts w:ascii="Times New Roman" w:hAnsi="Times New Roman"/>
+          <w:b w:val="0"/>
+          <w:i w:val="0"/>
+          <w:sz w:val="16"/>
+        </w:rPr>
+        <w:t>, vol. 243, Art. no. 111792, 2020, doi: 10.1016/j.rse.2020.111792.</w:t>
+      </w:r>
+    </w:p>
+    <w:p>
+      <w:pPr>
+        <w:ind w:left="360" w:hanging="360"/>
+        <w:jc w:val="both"/>
+      </w:pPr>
+      <w:r>
+        <w:rPr>
+          <w:rFonts w:ascii="Times New Roman" w:hAnsi="Times New Roman"/>
+          <w:b w:val="0"/>
+          <w:i w:val="0"/>
+          <w:sz w:val="16"/>
+        </w:rPr>
+        <w:t xml:space="preserve">[34] </w:t>
+      </w:r>
+      <w:r>
+        <w:rPr>
+          <w:rFonts w:ascii="Times New Roman" w:hAnsi="Times New Roman"/>
+          <w:b w:val="0"/>
+          <w:i w:val="0"/>
+          <w:sz w:val="16"/>
+        </w:rPr>
+        <w:t xml:space="preserve">G. Forzieri, V. Dakos, N. G. McDowell, A. Ramdane, and A. Cescatti, “Emerging signals of declining forest resilience under climate change,” </w:t>
+      </w:r>
+      <w:r>
+        <w:rPr>
+          <w:rFonts w:ascii="Times New Roman" w:hAnsi="Times New Roman"/>
+          <w:b w:val="0"/>
+          <w:i/>
+          <w:sz w:val="16"/>
+        </w:rPr>
+        <w:t>Nature</w:t>
+      </w:r>
+      <w:r>
+        <w:rPr>
+          <w:rFonts w:ascii="Times New Roman" w:hAnsi="Times New Roman"/>
+          <w:b w:val="0"/>
+          <w:i w:val="0"/>
+          <w:sz w:val="16"/>
+        </w:rPr>
+        <w:t>, vol. 608, pp. 534–539, 2022.</w:t>
+      </w:r>
+    </w:p>
+    <w:p>
+      <w:pPr>
+        <w:ind w:left="360" w:hanging="360"/>
+        <w:jc w:val="both"/>
+      </w:pPr>
+      <w:r>
+        <w:rPr>
+          <w:rFonts w:ascii="Times New Roman" w:hAnsi="Times New Roman"/>
+          <w:b w:val="0"/>
+          <w:i w:val="0"/>
+          <w:sz w:val="16"/>
+        </w:rPr>
+        <w:t xml:space="preserve">[35] </w:t>
+      </w:r>
+      <w:r>
+        <w:rPr>
+          <w:rFonts w:ascii="Times New Roman" w:hAnsi="Times New Roman"/>
+          <w:b w:val="0"/>
+          <w:i w:val="0"/>
+          <w:sz w:val="16"/>
+        </w:rPr>
+        <w:t xml:space="preserve">C. F. Brown et al., “Dynamic World, near real-time global 10 m land use land cover mapping,” </w:t>
+      </w:r>
+      <w:r>
+        <w:rPr>
+          <w:rFonts w:ascii="Times New Roman" w:hAnsi="Times New Roman"/>
+          <w:b w:val="0"/>
+          <w:i/>
+          <w:sz w:val="16"/>
+        </w:rPr>
+        <w:t>Sci. Data</w:t>
+      </w:r>
+      <w:r>
+        <w:rPr>
+          <w:rFonts w:ascii="Times New Roman" w:hAnsi="Times New Roman"/>
+          <w:b w:val="0"/>
+          <w:i w:val="0"/>
+          <w:sz w:val="16"/>
+        </w:rPr>
+        <w:t>, vol. 9, Art. no. 251, 2022, doi: 10.1038/s41597-022-01307-4.</w:t>
+      </w:r>
+    </w:p>
+    <w:p>
+      <w:pPr>
+        <w:ind w:left="360" w:hanging="360"/>
+        <w:jc w:val="both"/>
+      </w:pPr>
+      <w:r>
+        <w:rPr>
+          <w:rFonts w:ascii="Times New Roman" w:hAnsi="Times New Roman"/>
+          <w:b w:val="0"/>
+          <w:i w:val="0"/>
+          <w:sz w:val="16"/>
+        </w:rPr>
+        <w:t xml:space="preserve">[36] </w:t>
+      </w:r>
+      <w:r>
+        <w:rPr>
+          <w:rFonts w:ascii="Times New Roman" w:hAnsi="Times New Roman"/>
+          <w:b w:val="0"/>
+          <w:i w:val="0"/>
+          <w:sz w:val="16"/>
+        </w:rPr>
+        <w:t xml:space="preserve">D. Valle, R. Izbicki, and R. V. Leite, “Quantifying uncertainty in land-use land-cover classification using conformal statistics,” </w:t>
+      </w:r>
+      <w:r>
+        <w:rPr>
+          <w:rFonts w:ascii="Times New Roman" w:hAnsi="Times New Roman"/>
+          <w:b w:val="0"/>
+          <w:i/>
+          <w:sz w:val="16"/>
+        </w:rPr>
+        <w:t>Remote Sens. Environ.</w:t>
+      </w:r>
+      <w:r>
+        <w:rPr>
+          <w:rFonts w:ascii="Times New Roman" w:hAnsi="Times New Roman"/>
+          <w:b w:val="0"/>
+          <w:i w:val="0"/>
+          <w:sz w:val="16"/>
+        </w:rPr>
+        <w:t>, vol. 295, Art. no. 113682, 2023, doi: 10.1016/j.rse.2023.113682.</w:t>
+      </w:r>
+    </w:p>
+    <w:p>
+      <w:pPr>
+        <w:ind w:left="360" w:hanging="360"/>
+        <w:jc w:val="both"/>
+      </w:pPr>
+      <w:r>
+        <w:rPr>
+          <w:rFonts w:ascii="Times New Roman" w:hAnsi="Times New Roman"/>
+          <w:b w:val="0"/>
+          <w:i w:val="0"/>
+          <w:sz w:val="16"/>
+        </w:rPr>
+        <w:t xml:space="preserve">[37] </w:t>
+      </w:r>
+      <w:r>
+        <w:rPr>
+          <w:rFonts w:ascii="Times New Roman" w:hAnsi="Times New Roman"/>
+          <w:b w:val="0"/>
+          <w:i w:val="0"/>
+          <w:sz w:val="16"/>
+        </w:rPr>
+        <w:t>Microsoft Open Source et al., “microsoft/PlanetaryComputer: October 2022,” version 2022.10.28, Zenodo, 2022, doi: 10.5281/zenodo.7261897.</w:t>
       </w:r>
     </w:p>
     <w:sectPr>

</xml_diff>

<commit_message>
Ref [1]: Ghosh & Sharma 2026 (AI for restoring land, IJECC) in IEEE style; all citations renumbered (38 refs); deck keeps team's plagiarism-check slide
</commit_message>
<xml_diff>
--- a/CARE-EW_Conference_Paper.docx
+++ b/CARE-EW_Conference_Paper.docx
@@ -251,7 +251,7 @@
           <w:i w:val="0"/>
           <w:sz w:val="20"/>
         </w:rPr>
-        <w:t xml:space="preserve">Land degradation affects a large share of the world's drylands, forests and croplands and is tracked by Sustainable Development Goal indicator 15.3.1 [1], [2]. Operational assessment relies on trends in productivity, land cover and soil carbon computed over multi-year windows [2], [3]. These products answer the question </w:t>
+        <w:t xml:space="preserve">Land degradation affects a large share of the world's drylands, forests and croplands, and artificial intelligence is increasingly used to map it and predict its drivers [1]. It is tracked by Sustainable Development Goal indicator 15.3.1 [2], [3]. Operational assessment relies on trends in productivity, land cover and soil carbon computed over multi-year windows [3], [4]. These products answer the question </w:t>
       </w:r>
       <w:r>
         <w:rPr>
@@ -303,7 +303,7 @@
           <w:i w:val="0"/>
           <w:sz w:val="20"/>
         </w:rPr>
-        <w:t>Two lines of research point toward such a warning system, but neither delivers it. Residual-trend methods separate rainfall-driven from human-driven vegetation change [4], [5], yet they are retrospective. Studies of resilience show that ecosystems approaching a transition recover more slowly from disturbance, visible as rising lag-1 autocorrelation and variance of their time series [6], [7]. Satellite records have been used to map these indicators at continental and global scale [8]–[10], but not to issue calibrated, pixel-level forecasts with a measured lead time and a controlled false-alarm rate. Machine-learning studies in remote sensing also tend to overstate accuracy because spatially and temporally autocorrelated samples leak between training and test sets [11], [12].</w:t>
+        <w:t>Two lines of research point toward such a warning system, but neither delivers it. Residual-trend methods separate rainfall-driven from human-driven vegetation change [5], [6], yet they are retrospective. Studies of resilience show that ecosystems approaching a transition recover more slowly from disturbance, visible as rising lag-1 autocorrelation and variance of their time series [7], [8]. Satellite records have been used to map these indicators at continental and global scale [9]–[11], but not to issue calibrated, pixel-level forecasts with a measured lead time and a controlled false-alarm rate. Machine-learning studies in remote sensing also tend to overstate accuracy because spatially and temporally autocorrelated samples leak between training and test sets [12], [13].</w:t>
       </w:r>
     </w:p>
     <w:p>
@@ -558,7 +558,7 @@
           <w:i w:val="0"/>
           <w:sz w:val="20"/>
         </w:rPr>
-        <w:t>Time-series residual trend analysis regresses vegetation index on climate and attributes the remaining trend to human activity; applied to global drylands it separates climate-driven from human-driven desertification [4]. Machine-learning classifiers on Sentinel-2 indices map current desertification classes with high accuracy [5], transformer networks on Sentinel-2 time series detect forest disturbance after it occurs [13], and global syntheses trace multiple degradation pathways from such indicators [3]. All are designed to detect change that has already happened.</w:t>
+        <w:t>Time-series residual trend analysis regresses vegetation index on climate and attributes the remaining trend to human activity; applied to global drylands it separates climate-driven from human-driven desertification [5]. Machine-learning classifiers on Sentinel-2 indices map current desertification classes with high accuracy [6], transformer networks on Sentinel-2 time series detect forest disturbance after it occurs [14], and global syntheses trace multiple degradation pathways from such indicators [4]. All are designed to detect change that has already happened.</w:t>
       </w:r>
     </w:p>
     <w:p>
@@ -589,7 +589,7 @@
           <w:i w:val="0"/>
           <w:sz w:val="20"/>
         </w:rPr>
-        <w:t>Spatio-temporal deep learning on Landsat time series classifies land use after deforestation across the tropics [14], and radar alerts from Sentinel-1 flag disturbance in humid tropical forests within weeks [15]. These systems are accurate for abrupt clearing but react to disturbance under way and are mostly limited to forests.</w:t>
+        <w:t>Spatio-temporal deep learning on Landsat time series classifies land use after deforestation across the tropics [15], and radar alerts from Sentinel-1 flag disturbance in humid tropical forests within weeks [16]. These systems are accurate for abrupt clearing but react to disturbance under way and are mostly limited to forests.</w:t>
       </w:r>
     </w:p>
     <w:p>
@@ -620,7 +620,7 @@
           <w:i w:val="0"/>
           <w:sz w:val="20"/>
         </w:rPr>
-        <w:t>Critical-slowing-down theory predicts rising autocorrelation and variance before a transition, and deep networks can learn such signals from time series [6], [7]. A satellite resilience-sensing system for the biosphere has been proposed [8], and studies found widespread resilience loss since the early 2000s [9], [10], declining forest resilience under climate change [34], and aridity thresholds beyond which drylands shift abruptly [16]. These are descriptive; whether they improve held-out forecasts is rarely tested.</w:t>
+        <w:t>Critical-slowing-down theory predicts rising autocorrelation and variance before a transition, and deep networks can learn such signals from time series [7], [8]. A satellite resilience-sensing system for the biosphere has been proposed [9], and studies found widespread resilience loss since the early 2000s [10], [11], declining forest resilience under climate change [35], and aridity thresholds beyond which drylands shift abruptly [17]. These are descriptive; whether they improve held-out forecasts is rarely tested.</w:t>
       </w:r>
     </w:p>
     <w:p>
@@ -826,7 +826,7 @@
                 <w:i w:val="0"/>
                 <w:sz w:val="13"/>
               </w:rPr>
-              <w:t>[4]</w:t>
+              <w:t>[5]</w:t>
             </w:r>
           </w:p>
         </w:tc>
@@ -958,7 +958,7 @@
                 <w:i w:val="0"/>
                 <w:sz w:val="13"/>
               </w:rPr>
-              <w:t>[5]</w:t>
+              <w:t>[6]</w:t>
             </w:r>
           </w:p>
         </w:tc>
@@ -1090,7 +1090,7 @@
                 <w:i w:val="0"/>
                 <w:sz w:val="13"/>
               </w:rPr>
-              <w:t>[13]</w:t>
+              <w:t>[14]</w:t>
             </w:r>
           </w:p>
         </w:tc>
@@ -1222,7 +1222,7 @@
                 <w:i w:val="0"/>
                 <w:sz w:val="13"/>
               </w:rPr>
-              <w:t>[14]</w:t>
+              <w:t>[15]</w:t>
             </w:r>
           </w:p>
         </w:tc>
@@ -1354,7 +1354,7 @@
                 <w:i w:val="0"/>
                 <w:sz w:val="13"/>
               </w:rPr>
-              <w:t>[15]</w:t>
+              <w:t>[16]</w:t>
             </w:r>
           </w:p>
         </w:tc>
@@ -1486,7 +1486,7 @@
                 <w:i w:val="0"/>
                 <w:sz w:val="13"/>
               </w:rPr>
-              <w:t>[8]</w:t>
+              <w:t>[9]</w:t>
             </w:r>
           </w:p>
         </w:tc>
@@ -1618,7 +1618,7 @@
                 <w:i w:val="0"/>
                 <w:sz w:val="13"/>
               </w:rPr>
-              <w:t>[9]</w:t>
+              <w:t>[10]</w:t>
             </w:r>
           </w:p>
         </w:tc>
@@ -2063,7 +2063,7 @@
           <w:i w:val="0"/>
           <w:sz w:val="20"/>
         </w:rPr>
-        <w:t xml:space="preserve"> All inputs are open: Sentinel-2 L2A [23] (10–20 m, 2017–2026), MODIS MOD13Q1 NDVI [25] (250 m, 2000–), ERA5 [27] / ERA5-Land [24] climate (precipitation, temperature, soil moisture, reference evapotranspiration), ESA WorldCover 2021 [17] (the deep-learning Dynamic World product [35] is an alternative), NASADEM terrain, JRC surface water (Landsat-based water mapping [33]) and HydroRIVERS. Landsat 8/9 [28] is used only to check labels. Data are read from the Microsoft Planetary Computer catalogue [37]; the same workflow can run on Google Earth Engine [29].</w:t>
+        <w:t xml:space="preserve"> All inputs are open: Sentinel-2 L2A [24] (10–20 m, 2017–2026), MODIS MOD13Q1 NDVI [26] (250 m, 2000–), ERA5 [28] / ERA5-Land [25] climate (precipitation, temperature, soil moisture, reference evapotranspiration), ESA WorldCover 2021 [18] (the deep-learning Dynamic World product [36] is an alternative), NASADEM terrain, JRC surface water (Landsat-based water mapping [34]) and HydroRIVERS. Landsat 8/9 [29] is used only to check labels. Data are read from the Microsoft Planetary Computer catalogue [38]; the same workflow can run on Google Earth Engine [30].</w:t>
       </w:r>
     </w:p>
     <w:p>
@@ -3830,7 +3830,7 @@
           <w:i w:val="0"/>
           <w:sz w:val="20"/>
         </w:rPr>
-        <w:t xml:space="preserve">LightGBM, a gradient-boosted tree ensemble (tree ensembles remain the strongest model family on tabular data [18]), minimises the weighted logistic loss with an L2 penalty on leaf values </w:t>
+        <w:t xml:space="preserve">LightGBM, a gradient-boosted tree ensemble (tree ensembles remain the strongest model family on tabular data [19]), minimises the weighted logistic loss with an L2 penalty on leaf values </w:t>
       </w:r>
       <w:r>
         <w:rPr>
@@ -4054,7 +4054,7 @@
           <w:i w:val="0"/>
           <w:sz w:val="20"/>
         </w:rPr>
-        <w:t>Each pixel contributes about 40 strongly autocorrelated monthly rows, so deep trees memorise pixels. Trees are therefore kept small (Table III). Scores are calibrated by isotonic regression [19] on a disjoint calibration set. A Mondrian split-conformal predictor [20], [21], as used for land-cover maps [36], with α = 0.10 returns the prediction set:</w:t>
+        <w:t>Each pixel contributes about 40 strongly autocorrelated monthly rows, so deep trees memorise pixels. Trees are therefore kept small (Table III). Scores are calibrated by isotonic regression [20] on a disjoint calibration set. A Mondrian split-conformal predictor [21], [22], as used for land-cover maps [37], with α = 0.10 returns the prediction set:</w:t>
       </w:r>
     </w:p>
     <w:p>
@@ -4760,7 +4760,7 @@
                 <w:i w:val="0"/>
                 <w:sz w:val="14"/>
               </w:rPr>
-              <w:t>Python; LightGBM, scikit-learn, SHAP [32]</w:t>
+              <w:t>Python; LightGBM, scikit-learn, SHAP [33]</w:t>
             </w:r>
           </w:p>
         </w:tc>
@@ -6031,7 +6031,7 @@
           <w:i w:val="0"/>
           <w:sz w:val="20"/>
         </w:rPr>
-        <w:t>Further pre-registered experiments were rejected because they did not raise validation AP by at least 0.005: GLCM texture (a hand-crafted stand-in for the spatial filters a CNN learns [31]), red-edge chlorophyll indices, doubling the pixels per site, confident-learning label cleaning [22], a five-seed ensemble and training on all 23 sites.</w:t>
+        <w:t>Further pre-registered experiments were rejected because they did not raise validation AP by at least 0.005: GLCM texture (a hand-crafted stand-in for the spatial filters a CNN learns [32]), red-edge chlorophyll indices, doubling the pixels per site, confident-learning label cleaning [23], a five-seed ensemble and training on all 23 sites.</w:t>
       </w:r>
     </w:p>
     <w:p>
@@ -8309,7 +8309,7 @@
           <w:i w:val="0"/>
           <w:sz w:val="20"/>
         </w:rPr>
-        <w:t>The ablation supports the central hypothesis in a falsifiable way. If future degradation could be read from present greenness or from weather alone, groups A1–A3 would score well; they do not. Skill appears only once each pixel is compared with what climate and its landscape peers predict, and it grows when the autocorrelation and variance of that residual are added. SHAP attributions [32] agree: the most influential features are the MODIS 5-year variance, the share of the last 12 months below expectation and the 24-month AC1. This is the pattern critical-slowing-down theory predicts [6], [7], here tested on held-out data rather than assumed. We do not claim that rising autocorrelation marks a tipping point, only that it improves forecasts.</w:t>
+        <w:t>The ablation supports the central hypothesis in a falsifiable way. If future degradation could be read from present greenness or from weather alone, groups A1–A3 would score well; they do not. Skill appears only once each pixel is compared with what climate and its landscape peers predict, and it grows when the autocorrelation and variance of that residual are added. SHAP attributions [33] agree: the most influential features are the MODIS 5-year variance, the share of the last 12 months below expectation and the 24-month AC1. This is the pattern critical-slowing-down theory predicts [7], [8], here tested on held-out data rather than assumed. We do not claim that rising autocorrelation marks a tipping point, only that it improves forecasts.</w:t>
       </w:r>
     </w:p>
     <w:p>
@@ -8472,7 +8472,7 @@
           <w:i w:val="0"/>
           <w:sz w:val="20"/>
         </w:rPr>
-        <w:t xml:space="preserve"> The Sentinel-2 baseline covers only 2017–2020, climate is at 9–25 km, and ERA5 rainfall is weaker than gauge-blended products over convective tropics, where deep-learning retrievals are improving [26].</w:t>
+        <w:t xml:space="preserve"> The Sentinel-2 baseline covers only 2017–2020, climate is at 9–25 km, and ERA5 rainfall is weaker than gauge-blended products over convective tropics, where deep-learning retrievals are improving [27].</w:t>
       </w:r>
     </w:p>
     <w:p>
@@ -8660,7 +8660,7 @@
           <w:i w:val="0"/>
           <w:sz w:val="20"/>
         </w:rPr>
-        <w:t>Sentinel-1 radar features to fill monsoon cloud gaps, and SoilGrids [30] soil properties to separate erosion-prone soils.</w:t>
+        <w:t>Sentinel-1 radar features to fill monsoon cloud gaps, and SoilGrids [31] soil properties to separate erosion-prone soils.</w:t>
       </w:r>
     </w:p>
     <w:p>
@@ -8701,7 +8701,7 @@
           <w:i w:val="0"/>
           <w:sz w:val="16"/>
         </w:rPr>
-        <w:t xml:space="preserve">UNCCD, </w:t>
+        <w:t xml:space="preserve">S. Ghosh and J. V. Sharma, “Artificial intelligence for restoring land: A review of land degradation mapping, climate change prediction and ecosystem service valuation,” </w:t>
       </w:r>
       <w:r>
         <w:rPr>
@@ -8710,7 +8710,7 @@
           <w:i/>
           <w:sz w:val="16"/>
         </w:rPr>
-        <w:t>Global Land Outlook</w:t>
+        <w:t>Int. J. Environ. Clim. Change</w:t>
       </w:r>
       <w:r>
         <w:rPr>
@@ -8719,7 +8719,7 @@
           <w:i w:val="0"/>
           <w:sz w:val="16"/>
         </w:rPr>
-        <w:t>, 2nd ed., “Land Restoration for Recovery and Resilience.” Bonn, Germany: United Nations Convention to Combat Desertification, 2022.</w:t>
+        <w:t>, vol. 16, no. 5, pp. 352–375, 2026.</w:t>
       </w:r>
     </w:p>
     <w:p>
@@ -8743,7 +8743,25 @@
           <w:i w:val="0"/>
           <w:sz w:val="16"/>
         </w:rPr>
-        <w:t>N. C. Sims et al., “Good practice guidance: SDG indicator 15.3.1, version 2.0,” UNCCD, Bonn, Germany, 2021.</w:t>
+        <w:t xml:space="preserve">UNCCD, </w:t>
+      </w:r>
+      <w:r>
+        <w:rPr>
+          <w:rFonts w:ascii="Times New Roman" w:hAnsi="Times New Roman"/>
+          <w:b w:val="0"/>
+          <w:i/>
+          <w:sz w:val="16"/>
+        </w:rPr>
+        <w:t>Global Land Outlook</w:t>
+      </w:r>
+      <w:r>
+        <w:rPr>
+          <w:rFonts w:ascii="Times New Roman" w:hAnsi="Times New Roman"/>
+          <w:b w:val="0"/>
+          <w:i w:val="0"/>
+          <w:sz w:val="16"/>
+        </w:rPr>
+        <w:t>, 2nd ed., “Land Restoration for Recovery and Resilience.” Bonn, Germany: United Nations Convention to Combat Desertification, 2022.</w:t>
       </w:r>
     </w:p>
     <w:p>
@@ -8767,25 +8785,7 @@
           <w:i w:val="0"/>
           <w:sz w:val="16"/>
         </w:rPr>
-        <w:t xml:space="preserve">R. Prăvălie, “Exploring the multiple land degradation pathways across the planet,” </w:t>
-      </w:r>
-      <w:r>
-        <w:rPr>
-          <w:rFonts w:ascii="Times New Roman" w:hAnsi="Times New Roman"/>
-          <w:b w:val="0"/>
-          <w:i/>
-          <w:sz w:val="16"/>
-        </w:rPr>
-        <w:t>Earth-Sci. Rev.</w:t>
-      </w:r>
-      <w:r>
-        <w:rPr>
-          <w:rFonts w:ascii="Times New Roman" w:hAnsi="Times New Roman"/>
-          <w:b w:val="0"/>
-          <w:i w:val="0"/>
-          <w:sz w:val="16"/>
-        </w:rPr>
-        <w:t>, vol. 220, Art. no. 103689, 2021, doi: 10.1016/j.earscirev.2021.103689.</w:t>
+        <w:t>N. C. Sims et al., “Good practice guidance: SDG indicator 15.3.1, version 2.0,” UNCCD, Bonn, Germany, 2021.</w:t>
       </w:r>
     </w:p>
     <w:p>
@@ -8809,7 +8809,7 @@
           <w:i w:val="0"/>
           <w:sz w:val="16"/>
         </w:rPr>
-        <w:t xml:space="preserve">A. L. Burrell, J. P. Evans, and M. G. De Kauwe, “Anthropogenic climate change has driven over 5 million km² of drylands towards desertification,” </w:t>
+        <w:t xml:space="preserve">R. Prăvălie, “Exploring the multiple land degradation pathways across the planet,” </w:t>
       </w:r>
       <w:r>
         <w:rPr>
@@ -8818,7 +8818,7 @@
           <w:i/>
           <w:sz w:val="16"/>
         </w:rPr>
-        <w:t>Nature Commun.</w:t>
+        <w:t>Earth-Sci. Rev.</w:t>
       </w:r>
       <w:r>
         <w:rPr>
@@ -8827,7 +8827,7 @@
           <w:i w:val="0"/>
           <w:sz w:val="16"/>
         </w:rPr>
-        <w:t>, vol. 11, Art. no. 3853, 2020, doi: 10.1038/s41467-020-17710-7.</w:t>
+        <w:t>, vol. 220, Art. no. 103689, 2021, doi: 10.1016/j.earscirev.2021.103689.</w:t>
       </w:r>
     </w:p>
     <w:p>
@@ -8851,7 +8851,7 @@
           <w:i w:val="0"/>
           <w:sz w:val="16"/>
         </w:rPr>
-        <w:t xml:space="preserve">A. Berdyyev, Y. A. Al-Masnay, M. Juliev, and J. Abuduwaili, “Desertification monitoring using machine learning techniques with multiple indicators derived from Sentinel-2 in Turkmenistan,” </w:t>
+        <w:t xml:space="preserve">A. L. Burrell, J. P. Evans, and M. G. De Kauwe, “Anthropogenic climate change has driven over 5 million km² of drylands towards desertification,” </w:t>
       </w:r>
       <w:r>
         <w:rPr>
@@ -8860,7 +8860,7 @@
           <w:i/>
           <w:sz w:val="16"/>
         </w:rPr>
-        <w:t>Remote Sens.</w:t>
+        <w:t>Nature Commun.</w:t>
       </w:r>
       <w:r>
         <w:rPr>
@@ -8869,7 +8869,7 @@
           <w:i w:val="0"/>
           <w:sz w:val="16"/>
         </w:rPr>
-        <w:t>, vol. 16, no. 23, Art. no. 4525, 2024, doi: 10.3390/rs16234525.</w:t>
+        <w:t>, vol. 11, Art. no. 3853, 2020, doi: 10.1038/s41467-020-17710-7.</w:t>
       </w:r>
     </w:p>
     <w:p>
@@ -8893,7 +8893,7 @@
           <w:i w:val="0"/>
           <w:sz w:val="16"/>
         </w:rPr>
-        <w:t xml:space="preserve">T. M. Bury et al., “Deep learning for early warning signals of tipping points,” </w:t>
+        <w:t xml:space="preserve">A. Berdyyev, Y. A. Al-Masnay, M. Juliev, and J. Abuduwaili, “Desertification monitoring using machine learning techniques with multiple indicators derived from Sentinel-2 in Turkmenistan,” </w:t>
       </w:r>
       <w:r>
         <w:rPr>
@@ -8902,7 +8902,7 @@
           <w:i/>
           <w:sz w:val="16"/>
         </w:rPr>
-        <w:t>Proc. Natl. Acad. Sci. USA</w:t>
+        <w:t>Remote Sens.</w:t>
       </w:r>
       <w:r>
         <w:rPr>
@@ -8911,7 +8911,7 @@
           <w:i w:val="0"/>
           <w:sz w:val="16"/>
         </w:rPr>
-        <w:t>, vol. 118, no. 39, Art. no. e2106140118, 2021, doi: 10.1073/pnas.2106140118.</w:t>
+        <w:t>, vol. 16, no. 23, Art. no. 4525, 2024, doi: 10.3390/rs16234525.</w:t>
       </w:r>
     </w:p>
     <w:p>
@@ -8935,7 +8935,7 @@
           <w:i w:val="0"/>
           <w:sz w:val="16"/>
         </w:rPr>
-        <w:t xml:space="preserve">V. Dakos et al., “Tipping point detection and early warnings in climate, ecological, and human systems,” </w:t>
+        <w:t xml:space="preserve">T. M. Bury et al., “Deep learning for early warning signals of tipping points,” </w:t>
       </w:r>
       <w:r>
         <w:rPr>
@@ -8944,7 +8944,7 @@
           <w:i/>
           <w:sz w:val="16"/>
         </w:rPr>
-        <w:t>Earth Syst. Dyn.</w:t>
+        <w:t>Proc. Natl. Acad. Sci. USA</w:t>
       </w:r>
       <w:r>
         <w:rPr>
@@ -8953,7 +8953,7 @@
           <w:i w:val="0"/>
           <w:sz w:val="16"/>
         </w:rPr>
-        <w:t>, vol. 15, no. 4, pp. 1117–1135, 2024, doi: 10.5194/esd-15-1117-2024.</w:t>
+        <w:t>, vol. 118, no. 39, Art. no. e2106140118, 2021, doi: 10.1073/pnas.2106140118.</w:t>
       </w:r>
     </w:p>
     <w:p>
@@ -8977,7 +8977,7 @@
           <w:i w:val="0"/>
           <w:sz w:val="16"/>
         </w:rPr>
-        <w:t xml:space="preserve">T. M. Lenton et al., “A resilience sensing system for the biosphere,” </w:t>
+        <w:t xml:space="preserve">V. Dakos et al., “Tipping point detection and early warnings in climate, ecological, and human systems,” </w:t>
       </w:r>
       <w:r>
         <w:rPr>
@@ -8986,7 +8986,7 @@
           <w:i/>
           <w:sz w:val="16"/>
         </w:rPr>
-        <w:t>Phil. Trans. R. Soc. B</w:t>
+        <w:t>Earth Syst. Dyn.</w:t>
       </w:r>
       <w:r>
         <w:rPr>
@@ -8995,7 +8995,7 @@
           <w:i w:val="0"/>
           <w:sz w:val="16"/>
         </w:rPr>
-        <w:t>, vol. 377, no. 1857, Art. no. 20210383, 2022, doi: 10.1098/rstb.2021.0383.</w:t>
+        <w:t>, vol. 15, no. 4, pp. 1117–1135, 2024, doi: 10.5194/esd-15-1117-2024.</w:t>
       </w:r>
     </w:p>
     <w:p>
@@ -9019,7 +9019,7 @@
           <w:i w:val="0"/>
           <w:sz w:val="16"/>
         </w:rPr>
-        <w:t xml:space="preserve">T. Smith, D. Traxl, and N. Boers, “Empirical evidence for recent global shifts in vegetation resilience,” </w:t>
+        <w:t xml:space="preserve">T. M. Lenton et al., “A resilience sensing system for the biosphere,” </w:t>
       </w:r>
       <w:r>
         <w:rPr>
@@ -9028,7 +9028,7 @@
           <w:i/>
           <w:sz w:val="16"/>
         </w:rPr>
-        <w:t>Nature Clim. Change</w:t>
+        <w:t>Phil. Trans. R. Soc. B</w:t>
       </w:r>
       <w:r>
         <w:rPr>
@@ -9037,7 +9037,7 @@
           <w:i w:val="0"/>
           <w:sz w:val="16"/>
         </w:rPr>
-        <w:t>, vol. 12, pp. 477–484, 2022.</w:t>
+        <w:t>, vol. 377, no. 1857, Art. no. 20210383, 2022, doi: 10.1098/rstb.2021.0383.</w:t>
       </w:r>
     </w:p>
     <w:p>
@@ -9061,7 +9061,7 @@
           <w:i w:val="0"/>
           <w:sz w:val="16"/>
         </w:rPr>
-        <w:t xml:space="preserve">C. A. Boulton, T. M. Lenton, and N. Boers, “Pronounced loss of Amazon rainforest resilience since the early 2000s,” </w:t>
+        <w:t xml:space="preserve">T. Smith, D. Traxl, and N. Boers, “Empirical evidence for recent global shifts in vegetation resilience,” </w:t>
       </w:r>
       <w:r>
         <w:rPr>
@@ -9079,7 +9079,7 @@
           <w:i w:val="0"/>
           <w:sz w:val="16"/>
         </w:rPr>
-        <w:t>, vol. 12, pp. 271–278, 2022.</w:t>
+        <w:t>, vol. 12, pp. 477–484, 2022.</w:t>
       </w:r>
     </w:p>
     <w:p>
@@ -9103,7 +9103,7 @@
           <w:i w:val="0"/>
           <w:sz w:val="16"/>
         </w:rPr>
-        <w:t xml:space="preserve">P. Ploton et al., “Spatial validation reveals poor predictive performance of large-scale ecological mapping models,” </w:t>
+        <w:t xml:space="preserve">C. A. Boulton, T. M. Lenton, and N. Boers, “Pronounced loss of Amazon rainforest resilience since the early 2000s,” </w:t>
       </w:r>
       <w:r>
         <w:rPr>
@@ -9112,7 +9112,7 @@
           <w:i/>
           <w:sz w:val="16"/>
         </w:rPr>
-        <w:t>Nature Commun.</w:t>
+        <w:t>Nature Clim. Change</w:t>
       </w:r>
       <w:r>
         <w:rPr>
@@ -9121,7 +9121,7 @@
           <w:i w:val="0"/>
           <w:sz w:val="16"/>
         </w:rPr>
-        <w:t>, vol. 11, 4540, 2020.</w:t>
+        <w:t>, vol. 12, pp. 271–278, 2022.</w:t>
       </w:r>
     </w:p>
     <w:p>
@@ -9145,7 +9145,7 @@
           <w:i w:val="0"/>
           <w:sz w:val="16"/>
         </w:rPr>
-        <w:t xml:space="preserve">H. Meyer and E. Pebesma, “Predicting into unknown space? Estimating the area of applicability of spatial prediction models,” </w:t>
+        <w:t xml:space="preserve">P. Ploton et al., “Spatial validation reveals poor predictive performance of large-scale ecological mapping models,” </w:t>
       </w:r>
       <w:r>
         <w:rPr>
@@ -9154,7 +9154,7 @@
           <w:i/>
           <w:sz w:val="16"/>
         </w:rPr>
-        <w:t>Methods Ecol. Evol.</w:t>
+        <w:t>Nature Commun.</w:t>
       </w:r>
       <w:r>
         <w:rPr>
@@ -9163,7 +9163,7 @@
           <w:i w:val="0"/>
           <w:sz w:val="16"/>
         </w:rPr>
-        <w:t>, vol. 12, no. 9, pp. 1620–1633, 2021.</w:t>
+        <w:t>, vol. 11, 4540, 2020.</w:t>
       </w:r>
     </w:p>
     <w:p>
@@ -9187,7 +9187,7 @@
           <w:i w:val="0"/>
           <w:sz w:val="16"/>
         </w:rPr>
-        <w:t xml:space="preserve">C. Schiller, J. Költzow, S. Schwarz, F. Schiefer, and F. E. Fassnacht, “Forest disturbance detection in Central Europe using transformers and Sentinel-2 time series,” </w:t>
+        <w:t xml:space="preserve">H. Meyer and E. Pebesma, “Predicting into unknown space? Estimating the area of applicability of spatial prediction models,” </w:t>
       </w:r>
       <w:r>
         <w:rPr>
@@ -9196,7 +9196,7 @@
           <w:i/>
           <w:sz w:val="16"/>
         </w:rPr>
-        <w:t>Remote Sens. Environ.</w:t>
+        <w:t>Methods Ecol. Evol.</w:t>
       </w:r>
       <w:r>
         <w:rPr>
@@ -9205,7 +9205,7 @@
           <w:i w:val="0"/>
           <w:sz w:val="16"/>
         </w:rPr>
-        <w:t>, vol. 315, Art. no. 114475, 2024, doi: 10.1016/j.rse.2024.114475.</w:t>
+        <w:t>, vol. 12, no. 9, pp. 1620–1633, 2021.</w:t>
       </w:r>
     </w:p>
     <w:p>
@@ -9229,7 +9229,7 @@
           <w:i w:val="0"/>
           <w:sz w:val="16"/>
         </w:rPr>
-        <w:t xml:space="preserve">R. N. Masolele et al., “Spatial and temporal deep learning methods for deriving land-use following deforestation: A pan-tropical case study using Landsat time series,” </w:t>
+        <w:t xml:space="preserve">C. Schiller, J. Költzow, S. Schwarz, F. Schiefer, and F. E. Fassnacht, “Forest disturbance detection in Central Europe using transformers and Sentinel-2 time series,” </w:t>
       </w:r>
       <w:r>
         <w:rPr>
@@ -9247,7 +9247,7 @@
           <w:i w:val="0"/>
           <w:sz w:val="16"/>
         </w:rPr>
-        <w:t>, vol. 264, Art. no. 112600, 2021, doi: 10.1016/j.rse.2021.112600.</w:t>
+        <w:t>, vol. 315, Art. no. 114475, 2024, doi: 10.1016/j.rse.2024.114475.</w:t>
       </w:r>
     </w:p>
     <w:p>
@@ -9271,7 +9271,7 @@
           <w:i w:val="0"/>
           <w:sz w:val="16"/>
         </w:rPr>
-        <w:t xml:space="preserve">J. Reiche et al., “Forest disturbance alerts for the Congo Basin using Sentinel-1,” </w:t>
+        <w:t xml:space="preserve">R. N. Masolele et al., “Spatial and temporal deep learning methods for deriving land-use following deforestation: A pan-tropical case study using Landsat time series,” </w:t>
       </w:r>
       <w:r>
         <w:rPr>
@@ -9280,7 +9280,7 @@
           <w:i/>
           <w:sz w:val="16"/>
         </w:rPr>
-        <w:t>Environ. Res. Lett.</w:t>
+        <w:t>Remote Sens. Environ.</w:t>
       </w:r>
       <w:r>
         <w:rPr>
@@ -9289,7 +9289,7 @@
           <w:i w:val="0"/>
           <w:sz w:val="16"/>
         </w:rPr>
-        <w:t>, vol. 16, no. 2, 024005, 2021.</w:t>
+        <w:t>, vol. 264, Art. no. 112600, 2021, doi: 10.1016/j.rse.2021.112600.</w:t>
       </w:r>
     </w:p>
     <w:p>
@@ -9313,7 +9313,7 @@
           <w:i w:val="0"/>
           <w:sz w:val="16"/>
         </w:rPr>
-        <w:t xml:space="preserve">M. Berdugo et al., “Global ecosystem thresholds driven by aridity,” </w:t>
+        <w:t xml:space="preserve">J. Reiche et al., “Forest disturbance alerts for the Congo Basin using Sentinel-1,” </w:t>
       </w:r>
       <w:r>
         <w:rPr>
@@ -9322,7 +9322,7 @@
           <w:i/>
           <w:sz w:val="16"/>
         </w:rPr>
-        <w:t>Science</w:t>
+        <w:t>Environ. Res. Lett.</w:t>
       </w:r>
       <w:r>
         <w:rPr>
@@ -9331,7 +9331,7 @@
           <w:i w:val="0"/>
           <w:sz w:val="16"/>
         </w:rPr>
-        <w:t>, vol. 367, no. 6479, pp. 787–790, 2020, doi: 10.1126/science.aay5958.</w:t>
+        <w:t>, vol. 16, no. 2, 024005, 2021.</w:t>
       </w:r>
     </w:p>
     <w:p>
@@ -9355,7 +9355,25 @@
           <w:i w:val="0"/>
           <w:sz w:val="16"/>
         </w:rPr>
-        <w:t>D. Zanaga et al., “ESA WorldCover 10 m 2021 v200,” Zenodo, 2022, doi: 10.5281/zenodo.7254221.</w:t>
+        <w:t xml:space="preserve">M. Berdugo et al., “Global ecosystem thresholds driven by aridity,” </w:t>
+      </w:r>
+      <w:r>
+        <w:rPr>
+          <w:rFonts w:ascii="Times New Roman" w:hAnsi="Times New Roman"/>
+          <w:b w:val="0"/>
+          <w:i/>
+          <w:sz w:val="16"/>
+        </w:rPr>
+        <w:t>Science</w:t>
+      </w:r>
+      <w:r>
+        <w:rPr>
+          <w:rFonts w:ascii="Times New Roman" w:hAnsi="Times New Roman"/>
+          <w:b w:val="0"/>
+          <w:i w:val="0"/>
+          <w:sz w:val="16"/>
+        </w:rPr>
+        <w:t>, vol. 367, no. 6479, pp. 787–790, 2020, doi: 10.1126/science.aay5958.</w:t>
       </w:r>
     </w:p>
     <w:p>
@@ -9379,25 +9397,7 @@
           <w:i w:val="0"/>
           <w:sz w:val="16"/>
         </w:rPr>
-        <w:t xml:space="preserve">L. Grinsztajn, E. Oyallon, and G. Varoquaux, “Why do tree-based models still outperform deep learning on typical tabular data?” in </w:t>
-      </w:r>
-      <w:r>
-        <w:rPr>
-          <w:rFonts w:ascii="Times New Roman" w:hAnsi="Times New Roman"/>
-          <w:b w:val="0"/>
-          <w:i/>
-          <w:sz w:val="16"/>
-        </w:rPr>
-        <w:t>Proc. NeurIPS Datasets and Benchmarks Track</w:t>
-      </w:r>
-      <w:r>
-        <w:rPr>
-          <w:rFonts w:ascii="Times New Roman" w:hAnsi="Times New Roman"/>
-          <w:b w:val="0"/>
-          <w:i w:val="0"/>
-          <w:sz w:val="16"/>
-        </w:rPr>
-        <w:t>, vol. 35, 2022, pp. 507–520.</w:t>
+        <w:t>D. Zanaga et al., “ESA WorldCover 10 m 2021 v200,” Zenodo, 2022, doi: 10.5281/zenodo.7254221.</w:t>
       </w:r>
     </w:p>
     <w:p>
@@ -9421,7 +9421,7 @@
           <w:i w:val="0"/>
           <w:sz w:val="16"/>
         </w:rPr>
-        <w:t xml:space="preserve">T. Silva Filho et al., “Classifier calibration: A survey on how to assess and improve predicted class probabilities,” </w:t>
+        <w:t xml:space="preserve">L. Grinsztajn, E. Oyallon, and G. Varoquaux, “Why do tree-based models still outperform deep learning on typical tabular data?” in </w:t>
       </w:r>
       <w:r>
         <w:rPr>
@@ -9430,7 +9430,7 @@
           <w:i/>
           <w:sz w:val="16"/>
         </w:rPr>
-        <w:t>Mach. Learn.</w:t>
+        <w:t>Proc. NeurIPS Datasets and Benchmarks Track</w:t>
       </w:r>
       <w:r>
         <w:rPr>
@@ -9439,7 +9439,7 @@
           <w:i w:val="0"/>
           <w:sz w:val="16"/>
         </w:rPr>
-        <w:t>, vol. 112, no. 9, pp. 3211–3260, 2023, doi: 10.1007/s10994-023-06336-7.</w:t>
+        <w:t>, vol. 35, 2022, pp. 507–520.</w:t>
       </w:r>
     </w:p>
     <w:p>
@@ -9463,7 +9463,7 @@
           <w:i w:val="0"/>
           <w:sz w:val="16"/>
         </w:rPr>
-        <w:t xml:space="preserve">V. Vovk, A. Gammerman, and G. Shafer, </w:t>
+        <w:t xml:space="preserve">T. Silva Filho et al., “Classifier calibration: A survey on how to assess and improve predicted class probabilities,” </w:t>
       </w:r>
       <w:r>
         <w:rPr>
@@ -9472,7 +9472,7 @@
           <w:i/>
           <w:sz w:val="16"/>
         </w:rPr>
-        <w:t>Algorithmic Learning in a Random World</w:t>
+        <w:t>Mach. Learn.</w:t>
       </w:r>
       <w:r>
         <w:rPr>
@@ -9481,7 +9481,7 @@
           <w:i w:val="0"/>
           <w:sz w:val="16"/>
         </w:rPr>
-        <w:t>, 2nd ed. Cham, Switzerland: Springer, 2022, doi: 10.1007/978-3-031-06649-8.</w:t>
+        <w:t>, vol. 112, no. 9, pp. 3211–3260, 2023, doi: 10.1007/s10994-023-06336-7.</w:t>
       </w:r>
     </w:p>
     <w:p>
@@ -9505,7 +9505,7 @@
           <w:i w:val="0"/>
           <w:sz w:val="16"/>
         </w:rPr>
-        <w:t xml:space="preserve">A. N. Angelopoulos and S. Bates, “Conformal prediction: A gentle introduction,” </w:t>
+        <w:t xml:space="preserve">V. Vovk, A. Gammerman, and G. Shafer, </w:t>
       </w:r>
       <w:r>
         <w:rPr>
@@ -9514,7 +9514,7 @@
           <w:i/>
           <w:sz w:val="16"/>
         </w:rPr>
-        <w:t>Found. Trends Mach. Learn.</w:t>
+        <w:t>Algorithmic Learning in a Random World</w:t>
       </w:r>
       <w:r>
         <w:rPr>
@@ -9523,7 +9523,7 @@
           <w:i w:val="0"/>
           <w:sz w:val="16"/>
         </w:rPr>
-        <w:t>, vol. 16, no. 4, pp. 494–591, 2023.</w:t>
+        <w:t>, 2nd ed. Cham, Switzerland: Springer, 2022, doi: 10.1007/978-3-031-06649-8.</w:t>
       </w:r>
     </w:p>
     <w:p>
@@ -9547,7 +9547,7 @@
           <w:i w:val="0"/>
           <w:sz w:val="16"/>
         </w:rPr>
-        <w:t xml:space="preserve">C. Northcutt, L. Jiang, and I. Chuang, “Confident learning: Estimating uncertainty in dataset labels,” </w:t>
+        <w:t xml:space="preserve">A. N. Angelopoulos and S. Bates, “Conformal prediction: A gentle introduction,” </w:t>
       </w:r>
       <w:r>
         <w:rPr>
@@ -9556,7 +9556,7 @@
           <w:i/>
           <w:sz w:val="16"/>
         </w:rPr>
-        <w:t>J. Artif. Intell. Res.</w:t>
+        <w:t>Found. Trends Mach. Learn.</w:t>
       </w:r>
       <w:r>
         <w:rPr>
@@ -9565,7 +9565,7 @@
           <w:i w:val="0"/>
           <w:sz w:val="16"/>
         </w:rPr>
-        <w:t>, vol. 70, pp. 1373–1411, 2021.</w:t>
+        <w:t>, vol. 16, no. 4, pp. 494–591, 2023.</w:t>
       </w:r>
     </w:p>
     <w:p>
@@ -9589,7 +9589,7 @@
           <w:i w:val="0"/>
           <w:sz w:val="16"/>
         </w:rPr>
-        <w:t xml:space="preserve">D. Phiri et al., “Sentinel-2 data for land cover/use mapping: A review,” </w:t>
+        <w:t xml:space="preserve">C. Northcutt, L. Jiang, and I. Chuang, “Confident learning: Estimating uncertainty in dataset labels,” </w:t>
       </w:r>
       <w:r>
         <w:rPr>
@@ -9598,7 +9598,7 @@
           <w:i/>
           <w:sz w:val="16"/>
         </w:rPr>
-        <w:t>Remote Sens.</w:t>
+        <w:t>J. Artif. Intell. Res.</w:t>
       </w:r>
       <w:r>
         <w:rPr>
@@ -9607,7 +9607,7 @@
           <w:i w:val="0"/>
           <w:sz w:val="16"/>
         </w:rPr>
-        <w:t>, vol. 12, no. 14, Art. no. 2291, 2020, doi: 10.3390/rs12142291.</w:t>
+        <w:t>, vol. 70, pp. 1373–1411, 2021.</w:t>
       </w:r>
     </w:p>
     <w:p>
@@ -9631,7 +9631,7 @@
           <w:i w:val="0"/>
           <w:sz w:val="16"/>
         </w:rPr>
-        <w:t xml:space="preserve">J. Muñoz-Sabater et al., “ERA5-Land: A state-of-the-art global reanalysis dataset for land applications,” </w:t>
+        <w:t xml:space="preserve">D. Phiri et al., “Sentinel-2 data for land cover/use mapping: A review,” </w:t>
       </w:r>
       <w:r>
         <w:rPr>
@@ -9640,7 +9640,7 @@
           <w:i/>
           <w:sz w:val="16"/>
         </w:rPr>
-        <w:t>Earth Syst. Sci. Data</w:t>
+        <w:t>Remote Sens.</w:t>
       </w:r>
       <w:r>
         <w:rPr>
@@ -9649,7 +9649,7 @@
           <w:i w:val="0"/>
           <w:sz w:val="16"/>
         </w:rPr>
-        <w:t>, vol. 13, pp. 4349–4383, 2021.</w:t>
+        <w:t>, vol. 12, no. 14, Art. no. 2291, 2020, doi: 10.3390/rs12142291.</w:t>
       </w:r>
     </w:p>
     <w:p>
@@ -9673,7 +9673,25 @@
           <w:i w:val="0"/>
           <w:sz w:val="16"/>
         </w:rPr>
-        <w:t>K. Didan, “MOD13Q1 MODIS/Terra vegetation indices 16-day L3 global 250 m SIN grid V061,” NASA EOSDIS Land Processes DAAC, 2021, doi: 10.5067/MODIS/MOD13Q1.061.</w:t>
+        <w:t xml:space="preserve">J. Muñoz-Sabater et al., “ERA5-Land: A state-of-the-art global reanalysis dataset for land applications,” </w:t>
+      </w:r>
+      <w:r>
+        <w:rPr>
+          <w:rFonts w:ascii="Times New Roman" w:hAnsi="Times New Roman"/>
+          <w:b w:val="0"/>
+          <w:i/>
+          <w:sz w:val="16"/>
+        </w:rPr>
+        <w:t>Earth Syst. Sci. Data</w:t>
+      </w:r>
+      <w:r>
+        <w:rPr>
+          <w:rFonts w:ascii="Times New Roman" w:hAnsi="Times New Roman"/>
+          <w:b w:val="0"/>
+          <w:i w:val="0"/>
+          <w:sz w:val="16"/>
+        </w:rPr>
+        <w:t>, vol. 13, pp. 4349–4383, 2021.</w:t>
       </w:r>
     </w:p>
     <w:p>
@@ -9697,25 +9715,7 @@
           <w:i w:val="0"/>
           <w:sz w:val="16"/>
         </w:rPr>
-        <w:t xml:space="preserve">Q. Yuan et al., “Deep learning in environmental remote sensing: Achievements and challenges,” </w:t>
-      </w:r>
-      <w:r>
-        <w:rPr>
-          <w:rFonts w:ascii="Times New Roman" w:hAnsi="Times New Roman"/>
-          <w:b w:val="0"/>
-          <w:i/>
-          <w:sz w:val="16"/>
-        </w:rPr>
-        <w:t>Remote Sens. Environ.</w:t>
-      </w:r>
-      <w:r>
-        <w:rPr>
-          <w:rFonts w:ascii="Times New Roman" w:hAnsi="Times New Roman"/>
-          <w:b w:val="0"/>
-          <w:i w:val="0"/>
-          <w:sz w:val="16"/>
-        </w:rPr>
-        <w:t>, vol. 241, Art. no. 111716, 2020, doi: 10.1016/j.rse.2020.111716.</w:t>
+        <w:t>K. Didan, “MOD13Q1 MODIS/Terra vegetation indices 16-day L3 global 250 m SIN grid V061,” NASA EOSDIS Land Processes DAAC, 2021, doi: 10.5067/MODIS/MOD13Q1.061.</w:t>
       </w:r>
     </w:p>
     <w:p>
@@ -9739,7 +9739,7 @@
           <w:i w:val="0"/>
           <w:sz w:val="16"/>
         </w:rPr>
-        <w:t xml:space="preserve">H. Hersbach et al., “The ERA5 global reanalysis,” </w:t>
+        <w:t xml:space="preserve">Q. Yuan et al., “Deep learning in environmental remote sensing: Achievements and challenges,” </w:t>
       </w:r>
       <w:r>
         <w:rPr>
@@ -9748,7 +9748,7 @@
           <w:i/>
           <w:sz w:val="16"/>
         </w:rPr>
-        <w:t>Q. J. R. Meteorol. Soc.</w:t>
+        <w:t>Remote Sens. Environ.</w:t>
       </w:r>
       <w:r>
         <w:rPr>
@@ -9757,7 +9757,7 @@
           <w:i w:val="0"/>
           <w:sz w:val="16"/>
         </w:rPr>
-        <w:t>, vol. 146, no. 730, pp. 1999–2049, 2020.</w:t>
+        <w:t>, vol. 241, Art. no. 111716, 2020, doi: 10.1016/j.rse.2020.111716.</w:t>
       </w:r>
     </w:p>
     <w:p>
@@ -9781,7 +9781,7 @@
           <w:i w:val="0"/>
           <w:sz w:val="16"/>
         </w:rPr>
-        <w:t xml:space="preserve">M. A. Wulder et al., “Fifty years of Landsat science and impacts,” </w:t>
+        <w:t xml:space="preserve">H. Hersbach et al., “The ERA5 global reanalysis,” </w:t>
       </w:r>
       <w:r>
         <w:rPr>
@@ -9790,7 +9790,7 @@
           <w:i/>
           <w:sz w:val="16"/>
         </w:rPr>
-        <w:t>Remote Sens. Environ.</w:t>
+        <w:t>Q. J. R. Meteorol. Soc.</w:t>
       </w:r>
       <w:r>
         <w:rPr>
@@ -9799,7 +9799,7 @@
           <w:i w:val="0"/>
           <w:sz w:val="16"/>
         </w:rPr>
-        <w:t>, vol. 280, 113195, 2022.</w:t>
+        <w:t>, vol. 146, no. 730, pp. 1999–2049, 2020.</w:t>
       </w:r>
     </w:p>
     <w:p>
@@ -9823,7 +9823,7 @@
           <w:i w:val="0"/>
           <w:sz w:val="16"/>
         </w:rPr>
-        <w:t xml:space="preserve">M. Amani et al., “Google Earth Engine cloud computing platform for remote sensing big data applications: A comprehensive review,” </w:t>
+        <w:t xml:space="preserve">M. A. Wulder et al., “Fifty years of Landsat science and impacts,” </w:t>
       </w:r>
       <w:r>
         <w:rPr>
@@ -9832,7 +9832,7 @@
           <w:i/>
           <w:sz w:val="16"/>
         </w:rPr>
-        <w:t>IEEE J. Sel. Topics Appl. Earth Observ. Remote Sens.</w:t>
+        <w:t>Remote Sens. Environ.</w:t>
       </w:r>
       <w:r>
         <w:rPr>
@@ -9841,7 +9841,7 @@
           <w:i w:val="0"/>
           <w:sz w:val="16"/>
         </w:rPr>
-        <w:t>, vol. 13, pp. 5326–5350, 2020, doi: 10.1109/JSTARS.2020.3021052.</w:t>
+        <w:t>, vol. 280, 113195, 2022.</w:t>
       </w:r>
     </w:p>
     <w:p>
@@ -9865,7 +9865,7 @@
           <w:i w:val="0"/>
           <w:sz w:val="16"/>
         </w:rPr>
-        <w:t xml:space="preserve">L. Poggio et al., “SoilGrids 2.0: Producing soil information for the globe with quantified spatial uncertainty,” </w:t>
+        <w:t xml:space="preserve">M. Amani et al., “Google Earth Engine cloud computing platform for remote sensing big data applications: A comprehensive review,” </w:t>
       </w:r>
       <w:r>
         <w:rPr>
@@ -9874,7 +9874,7 @@
           <w:i/>
           <w:sz w:val="16"/>
         </w:rPr>
-        <w:t>SOIL</w:t>
+        <w:t>IEEE J. Sel. Topics Appl. Earth Observ. Remote Sens.</w:t>
       </w:r>
       <w:r>
         <w:rPr>
@@ -9883,7 +9883,7 @@
           <w:i w:val="0"/>
           <w:sz w:val="16"/>
         </w:rPr>
-        <w:t>, vol. 7, pp. 217–240, 2021.</w:t>
+        <w:t>, vol. 13, pp. 5326–5350, 2020, doi: 10.1109/JSTARS.2020.3021052.</w:t>
       </w:r>
     </w:p>
     <w:p>
@@ -9907,7 +9907,7 @@
           <w:i w:val="0"/>
           <w:sz w:val="16"/>
         </w:rPr>
-        <w:t xml:space="preserve">T. Kattenborn, J. Leitloff, F. Schiefer, and S. Hinz, “Review on convolutional neural networks (CNN) in vegetation remote sensing,” </w:t>
+        <w:t xml:space="preserve">L. Poggio et al., “SoilGrids 2.0: Producing soil information for the globe with quantified spatial uncertainty,” </w:t>
       </w:r>
       <w:r>
         <w:rPr>
@@ -9916,7 +9916,7 @@
           <w:i/>
           <w:sz w:val="16"/>
         </w:rPr>
-        <w:t>ISPRS J. Photogramm. Remote Sens.</w:t>
+        <w:t>SOIL</w:t>
       </w:r>
       <w:r>
         <w:rPr>
@@ -9925,7 +9925,7 @@
           <w:i w:val="0"/>
           <w:sz w:val="16"/>
         </w:rPr>
-        <w:t>, vol. 173, pp. 24–49, 2021, doi: 10.1016/j.isprsjprs.2020.12.010.</w:t>
+        <w:t>, vol. 7, pp. 217–240, 2021.</w:t>
       </w:r>
     </w:p>
     <w:p>
@@ -9949,7 +9949,7 @@
           <w:i w:val="0"/>
           <w:sz w:val="16"/>
         </w:rPr>
-        <w:t xml:space="preserve">S. M. Lundberg et al., “From local explanations to global understanding with explainable AI for trees,” </w:t>
+        <w:t xml:space="preserve">T. Kattenborn, J. Leitloff, F. Schiefer, and S. Hinz, “Review on convolutional neural networks (CNN) in vegetation remote sensing,” </w:t>
       </w:r>
       <w:r>
         <w:rPr>
@@ -9958,7 +9958,7 @@
           <w:i/>
           <w:sz w:val="16"/>
         </w:rPr>
-        <w:t>Nature Mach. Intell.</w:t>
+        <w:t>ISPRS J. Photogramm. Remote Sens.</w:t>
       </w:r>
       <w:r>
         <w:rPr>
@@ -9967,7 +9967,7 @@
           <w:i w:val="0"/>
           <w:sz w:val="16"/>
         </w:rPr>
-        <w:t>, vol. 2, no. 1, pp. 56–67, 2020, doi: 10.1038/s42256-019-0138-9.</w:t>
+        <w:t>, vol. 173, pp. 24–49, 2021, doi: 10.1016/j.isprsjprs.2020.12.010.</w:t>
       </w:r>
     </w:p>
     <w:p>
@@ -9991,7 +9991,7 @@
           <w:i w:val="0"/>
           <w:sz w:val="16"/>
         </w:rPr>
-        <w:t xml:space="preserve">A. H. Pickens et al., “Mapping and sampling to characterize global inland water dynamics from 1999 to 2018 with full Landsat time-series,” </w:t>
+        <w:t xml:space="preserve">S. M. Lundberg et al., “From local explanations to global understanding with explainable AI for trees,” </w:t>
       </w:r>
       <w:r>
         <w:rPr>
@@ -10000,7 +10000,7 @@
           <w:i/>
           <w:sz w:val="16"/>
         </w:rPr>
-        <w:t>Remote Sens. Environ.</w:t>
+        <w:t>Nature Mach. Intell.</w:t>
       </w:r>
       <w:r>
         <w:rPr>
@@ -10009,7 +10009,7 @@
           <w:i w:val="0"/>
           <w:sz w:val="16"/>
         </w:rPr>
-        <w:t>, vol. 243, Art. no. 111792, 2020, doi: 10.1016/j.rse.2020.111792.</w:t>
+        <w:t>, vol. 2, no. 1, pp. 56–67, 2020, doi: 10.1038/s42256-019-0138-9.</w:t>
       </w:r>
     </w:p>
     <w:p>
@@ -10033,7 +10033,7 @@
           <w:i w:val="0"/>
           <w:sz w:val="16"/>
         </w:rPr>
-        <w:t xml:space="preserve">G. Forzieri, V. Dakos, N. G. McDowell, A. Ramdane, and A. Cescatti, “Emerging signals of declining forest resilience under climate change,” </w:t>
+        <w:t xml:space="preserve">A. H. Pickens et al., “Mapping and sampling to characterize global inland water dynamics from 1999 to 2018 with full Landsat time-series,” </w:t>
       </w:r>
       <w:r>
         <w:rPr>
@@ -10042,7 +10042,7 @@
           <w:i/>
           <w:sz w:val="16"/>
         </w:rPr>
-        <w:t>Nature</w:t>
+        <w:t>Remote Sens. Environ.</w:t>
       </w:r>
       <w:r>
         <w:rPr>
@@ -10051,7 +10051,7 @@
           <w:i w:val="0"/>
           <w:sz w:val="16"/>
         </w:rPr>
-        <w:t>, vol. 608, pp. 534–539, 2022.</w:t>
+        <w:t>, vol. 243, Art. no. 111792, 2020, doi: 10.1016/j.rse.2020.111792.</w:t>
       </w:r>
     </w:p>
     <w:p>
@@ -10075,7 +10075,7 @@
           <w:i w:val="0"/>
           <w:sz w:val="16"/>
         </w:rPr>
-        <w:t xml:space="preserve">C. F. Brown et al., “Dynamic World, near real-time global 10 m land use land cover mapping,” </w:t>
+        <w:t xml:space="preserve">G. Forzieri, V. Dakos, N. G. McDowell, A. Ramdane, and A. Cescatti, “Emerging signals of declining forest resilience under climate change,” </w:t>
       </w:r>
       <w:r>
         <w:rPr>
@@ -10084,7 +10084,7 @@
           <w:i/>
           <w:sz w:val="16"/>
         </w:rPr>
-        <w:t>Sci. Data</w:t>
+        <w:t>Nature</w:t>
       </w:r>
       <w:r>
         <w:rPr>
@@ -10093,7 +10093,7 @@
           <w:i w:val="0"/>
           <w:sz w:val="16"/>
         </w:rPr>
-        <w:t>, vol. 9, Art. no. 251, 2022, doi: 10.1038/s41597-022-01307-4.</w:t>
+        <w:t>, vol. 608, pp. 534–539, 2022.</w:t>
       </w:r>
     </w:p>
     <w:p>
@@ -10117,7 +10117,7 @@
           <w:i w:val="0"/>
           <w:sz w:val="16"/>
         </w:rPr>
-        <w:t xml:space="preserve">D. Valle, R. Izbicki, and R. V. Leite, “Quantifying uncertainty in land-use land-cover classification using conformal statistics,” </w:t>
+        <w:t xml:space="preserve">C. F. Brown et al., “Dynamic World, near real-time global 10 m land use land cover mapping,” </w:t>
       </w:r>
       <w:r>
         <w:rPr>
@@ -10126,7 +10126,7 @@
           <w:i/>
           <w:sz w:val="16"/>
         </w:rPr>
-        <w:t>Remote Sens. Environ.</w:t>
+        <w:t>Sci. Data</w:t>
       </w:r>
       <w:r>
         <w:rPr>
@@ -10135,7 +10135,7 @@
           <w:i w:val="0"/>
           <w:sz w:val="16"/>
         </w:rPr>
-        <w:t>, vol. 295, Art. no. 113682, 2023, doi: 10.1016/j.rse.2023.113682.</w:t>
+        <w:t>, vol. 9, Art. no. 251, 2022, doi: 10.1038/s41597-022-01307-4.</w:t>
       </w:r>
     </w:p>
     <w:p>
@@ -10151,6 +10151,48 @@
           <w:sz w:val="16"/>
         </w:rPr>
         <w:t xml:space="preserve">[37] </w:t>
+      </w:r>
+      <w:r>
+        <w:rPr>
+          <w:rFonts w:ascii="Times New Roman" w:hAnsi="Times New Roman"/>
+          <w:b w:val="0"/>
+          <w:i w:val="0"/>
+          <w:sz w:val="16"/>
+        </w:rPr>
+        <w:t xml:space="preserve">D. Valle, R. Izbicki, and R. V. Leite, “Quantifying uncertainty in land-use land-cover classification using conformal statistics,” </w:t>
+      </w:r>
+      <w:r>
+        <w:rPr>
+          <w:rFonts w:ascii="Times New Roman" w:hAnsi="Times New Roman"/>
+          <w:b w:val="0"/>
+          <w:i/>
+          <w:sz w:val="16"/>
+        </w:rPr>
+        <w:t>Remote Sens. Environ.</w:t>
+      </w:r>
+      <w:r>
+        <w:rPr>
+          <w:rFonts w:ascii="Times New Roman" w:hAnsi="Times New Roman"/>
+          <w:b w:val="0"/>
+          <w:i w:val="0"/>
+          <w:sz w:val="16"/>
+        </w:rPr>
+        <w:t>, vol. 295, Art. no. 113682, 2023, doi: 10.1016/j.rse.2023.113682.</w:t>
+      </w:r>
+    </w:p>
+    <w:p>
+      <w:pPr>
+        <w:ind w:left="360" w:hanging="360"/>
+        <w:jc w:val="both"/>
+      </w:pPr>
+      <w:r>
+        <w:rPr>
+          <w:rFonts w:ascii="Times New Roman" w:hAnsi="Times New Roman"/>
+          <w:b w:val="0"/>
+          <w:i w:val="0"/>
+          <w:sz w:val="16"/>
+        </w:rPr>
+        <w:t xml:space="preserve">[38] </w:t>
       </w:r>
       <w:r>
         <w:rPr>

</xml_diff>